<commit_message>
Revise report for Meeting Log 3 action items
</commit_message>
<xml_diff>
--- a/literature-review/prisma/prisma_flow_diagram_filled.docx
+++ b/literature-review/prisma/prisma_flow_diagram_filled.docx
@@ -70,7 +70,7 @@
                                 <w:sz w:val="17"/>
                                 <w:szCs w:val="17"/>
                               </w:rPr>
-                              <w:t>Identification of studies via other methods</w:t>
+                              <w:t>Identification of records</w:t>
                             </w:r>
                           </w:p>
                         </w:txbxContent>
@@ -93,7 +93,7 @@
               </wp:anchor>
             </w:drawing>
           </mc:Choice>
-          <mc:Fallback xmlns:w16se="http://schemas.microsoft.com/office/word/2015/wordml/symex" xmlns:w16sdtdh="http://schemas.microsoft.com/office/word/2020/wordml/sdtdatahash" xmlns:w16="http://schemas.microsoft.com/office/word/2018/wordml" xmlns:w16cid="http://schemas.microsoft.com/office/word/2016/wordml/cid" xmlns:w16cex="http://schemas.microsoft.com/office/word/2018/wordml/cex" xmlns:am3d="http://schemas.microsoft.com/office/drawing/2017/model3d" xmlns:aink="http://schemas.microsoft.com/office/drawing/2016/ink" xmlns:cx8="http://schemas.microsoft.com/office/drawing/2016/5/14/chartex" xmlns:cx7="http://schemas.microsoft.com/office/drawing/2016/5/13/chartex" xmlns:cx6="http://schemas.microsoft.com/office/drawing/2016/5/12/chartex" xmlns:cx5="http://schemas.microsoft.com/office/drawing/2016/5/11/chartex" xmlns:cx4="http://schemas.microsoft.com/office/drawing/2016/5/10/chartex" xmlns:cx3="http://schemas.microsoft.com/office/drawing/2016/5/9/chartex" xmlns:cx2="http://schemas.microsoft.com/office/drawing/2015/10/21/chartex" xmlns:cx1="http://schemas.microsoft.com/office/drawing/2015/9/8/chartex" xmlns:cx="http://schemas.microsoft.com/office/drawing/2014/chartex">
+          <mc:Fallback xmlns:cx="http://schemas.microsoft.com/office/drawing/2014/chartex" xmlns:cx1="http://schemas.microsoft.com/office/drawing/2015/9/8/chartex" xmlns:cx2="http://schemas.microsoft.com/office/drawing/2015/10/21/chartex" xmlns:cx3="http://schemas.microsoft.com/office/drawing/2016/5/9/chartex" xmlns:cx4="http://schemas.microsoft.com/office/drawing/2016/5/10/chartex" xmlns:cx5="http://schemas.microsoft.com/office/drawing/2016/5/11/chartex" xmlns:cx6="http://schemas.microsoft.com/office/drawing/2016/5/12/chartex" xmlns:cx7="http://schemas.microsoft.com/office/drawing/2016/5/13/chartex" xmlns:cx8="http://schemas.microsoft.com/office/drawing/2016/5/14/chartex" xmlns:aink="http://schemas.microsoft.com/office/drawing/2016/ink" xmlns:am3d="http://schemas.microsoft.com/office/drawing/2017/model3d" xmlns:w16cex="http://schemas.microsoft.com/office/word/2018/wordml/cex" xmlns:w16cid="http://schemas.microsoft.com/office/word/2016/wordml/cid" xmlns:w16="http://schemas.microsoft.com/office/word/2018/wordml" xmlns:w16sdtdh="http://schemas.microsoft.com/office/word/2020/wordml/sdtdatahash" xmlns:w16se="http://schemas.microsoft.com/office/word/2015/wordml/symex">
             <w:pict>
               <v:shapetype w14:anchorId="647CF0B2" id="_x0000_t176" coordsize="21600,21600" o:spt="176" adj="2700" path="m@0,qx0@0l0@2qy@0,21600l@1,21600qx21600@2l21600@0qy@1,xe">
                 <v:stroke joinstyle="miter"/>
@@ -126,7 +126,7 @@
                           <w:sz w:val="17"/>
                           <w:szCs w:val="17"/>
                         </w:rPr>
-                        <w:t>Identification of studies via other methods</w:t>
+                        <w:t>Identification of records</w:t>
                       </w:r>
                     </w:p>
                   </w:txbxContent>
@@ -200,7 +200,7 @@
                                 <w:sz w:val="17"/>
                                 <w:szCs w:val="17"/>
                               </w:rPr>
-                              <w:t>Identification of studies via databases and public metadata sources</w:t>
+                              <w:t>Identification of records</w:t>
                             </w:r>
                           </w:p>
                         </w:txbxContent>
@@ -223,7 +223,7 @@
               </wp:anchor>
             </w:drawing>
           </mc:Choice>
-          <mc:Fallback xmlns:w16se="http://schemas.microsoft.com/office/word/2015/wordml/symex" xmlns:w16sdtdh="http://schemas.microsoft.com/office/word/2020/wordml/sdtdatahash" xmlns:w16="http://schemas.microsoft.com/office/word/2018/wordml" xmlns:w16cid="http://schemas.microsoft.com/office/word/2016/wordml/cid" xmlns:w16cex="http://schemas.microsoft.com/office/word/2018/wordml/cex" xmlns:am3d="http://schemas.microsoft.com/office/drawing/2017/model3d" xmlns:aink="http://schemas.microsoft.com/office/drawing/2016/ink" xmlns:cx8="http://schemas.microsoft.com/office/drawing/2016/5/14/chartex" xmlns:cx7="http://schemas.microsoft.com/office/drawing/2016/5/13/chartex" xmlns:cx6="http://schemas.microsoft.com/office/drawing/2016/5/12/chartex" xmlns:cx5="http://schemas.microsoft.com/office/drawing/2016/5/11/chartex" xmlns:cx4="http://schemas.microsoft.com/office/drawing/2016/5/10/chartex" xmlns:cx3="http://schemas.microsoft.com/office/drawing/2016/5/9/chartex" xmlns:cx2="http://schemas.microsoft.com/office/drawing/2015/10/21/chartex" xmlns:cx1="http://schemas.microsoft.com/office/drawing/2015/9/8/chartex" xmlns:cx="http://schemas.microsoft.com/office/drawing/2014/chartex">
+          <mc:Fallback xmlns:cx="http://schemas.microsoft.com/office/drawing/2014/chartex" xmlns:cx1="http://schemas.microsoft.com/office/drawing/2015/9/8/chartex" xmlns:cx2="http://schemas.microsoft.com/office/drawing/2015/10/21/chartex" xmlns:cx3="http://schemas.microsoft.com/office/drawing/2016/5/9/chartex" xmlns:cx4="http://schemas.microsoft.com/office/drawing/2016/5/10/chartex" xmlns:cx5="http://schemas.microsoft.com/office/drawing/2016/5/11/chartex" xmlns:cx6="http://schemas.microsoft.com/office/drawing/2016/5/12/chartex" xmlns:cx7="http://schemas.microsoft.com/office/drawing/2016/5/13/chartex" xmlns:cx8="http://schemas.microsoft.com/office/drawing/2016/5/14/chartex" xmlns:aink="http://schemas.microsoft.com/office/drawing/2016/ink" xmlns:am3d="http://schemas.microsoft.com/office/drawing/2017/model3d" xmlns:w16cex="http://schemas.microsoft.com/office/word/2018/wordml/cex" xmlns:w16cid="http://schemas.microsoft.com/office/word/2016/wordml/cid" xmlns:w16="http://schemas.microsoft.com/office/word/2018/wordml" xmlns:w16sdtdh="http://schemas.microsoft.com/office/word/2020/wordml/sdtdatahash" xmlns:w16se="http://schemas.microsoft.com/office/word/2015/wordml/symex">
             <w:pict>
               <v:shape w14:anchorId="0A1B3F5E" id="Flowchart: Alternate Process 29" o:spid="_x0000_s1027" type="#_x0000_t176" style="position:absolute;margin-left:44.65pt;margin-top:5.85pt;width:342.15pt;height:20.7pt;z-index:251697152;visibility:visible;mso-wrap-style:square;mso-width-percent:0;mso-height-percent:0;mso-wrap-distance-left:9pt;mso-wrap-distance-top:0;mso-wrap-distance-right:9pt;mso-wrap-distance-bottom:0;mso-position-horizontal:absolute;mso-position-horizontal-relative:text;mso-position-vertical:absolute;mso-position-vertical-relative:text;mso-width-percent:0;mso-height-percent:0;mso-width-relative:margin;mso-height-relative:margin;v-text-anchor:middle" o:gfxdata="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" fillcolor="#ffc000 [3207]" strokecolor="#7f5f00 [1607]" strokeweight="1pt">
                 <v:textbox>
@@ -240,7 +240,7 @@
                           <w:sz w:val="17"/>
                           <w:szCs w:val="17"/>
                         </w:rPr>
-                        <w:t>Identification of studies via databases and public metadata sources</w:t>
+                        <w:t>Identification of records</w:t>
                       </w:r>
                     </w:p>
                   </w:txbxContent>
@@ -329,7 +329,7 @@
                                 <w:sz w:val="15"/>
                                 <w:szCs w:val="15"/>
                               </w:rPr>
-                              <w:t>Records identified from existing local PDF set</w:t>
+                              <w:t>Records identified from previously available papers</w:t>
                             </w:r>
                             <w:r>
                               <w:br/>
@@ -380,7 +380,7 @@
                           <w:sz w:val="15"/>
                           <w:szCs w:val="15"/>
                         </w:rPr>
-                        <w:t>Records identified from existing local PDF set</w:t>
+                        <w:t>Records identified from previously available papers</w:t>
                       </w:r>
                       <w:r>
                         <w:br/>
@@ -485,18 +485,6 @@
                               </w:rPr>
                               <w:t>(n = 45)</w:t>
                             </w:r>
-                            <w:r>
-                              <w:br/>
-                            </w:r>
-                            <w:r>
-                              <w:rPr>
-                                <w:rFonts w:ascii="Arial" w:hAnsi="Arial"/>
-                                <w:color w:val="000000"/>
-                                <w:sz w:val="15"/>
-                                <w:szCs w:val="15"/>
-                              </w:rPr>
-                              <w:t>Phase 3 = 15; Phase 7 = 30</w:t>
-                            </w:r>
                           </w:p>
                         </w:txbxContent>
                       </wps:txbx>
@@ -547,18 +535,6 @@
                           <w:szCs w:val="15"/>
                         </w:rPr>
                         <w:t>(n = 45)</w:t>
-                      </w:r>
-                      <w:r>
-                        <w:br/>
-                      </w:r>
-                      <w:r>
-                        <w:rPr>
-                          <w:rFonts w:ascii="Arial" w:hAnsi="Arial"/>
-                          <w:color w:val="000000"/>
-                          <w:sz w:val="15"/>
-                          <w:szCs w:val="15"/>
-                        </w:rPr>
-                        <w:t>Phase 3 = 15; Phase 7 = 30</w:t>
                       </w:r>
                     </w:p>
                   </w:txbxContent>
@@ -637,7 +613,7 @@
                                 <w:sz w:val="15"/>
                                 <w:szCs w:val="15"/>
                               </w:rPr>
-                              <w:t>Public database/metadata candidates</w:t>
+                              <w:t>Records identified from public database and metadata sources</w:t>
                             </w:r>
                             <w:r>
                               <w:br/>
@@ -712,7 +688,7 @@
                           <w:sz w:val="15"/>
                           <w:szCs w:val="15"/>
                         </w:rPr>
-                        <w:t>Public database/metadata candidates</w:t>
+                        <w:t>Records identified from public database and metadata sources</w:t>
                       </w:r>
                       <w:r>
                         <w:br/>
@@ -866,7 +842,7 @@
               </wp:anchor>
             </w:drawing>
           </mc:Choice>
-          <mc:Fallback xmlns:w16se="http://schemas.microsoft.com/office/word/2015/wordml/symex" xmlns:w16sdtdh="http://schemas.microsoft.com/office/word/2020/wordml/sdtdatahash" xmlns:w16="http://schemas.microsoft.com/office/word/2018/wordml" xmlns:w16cid="http://schemas.microsoft.com/office/word/2016/wordml/cid" xmlns:w16cex="http://schemas.microsoft.com/office/word/2018/wordml/cex" xmlns:am3d="http://schemas.microsoft.com/office/drawing/2017/model3d" xmlns:aink="http://schemas.microsoft.com/office/drawing/2016/ink" xmlns:cx8="http://schemas.microsoft.com/office/drawing/2016/5/14/chartex" xmlns:cx7="http://schemas.microsoft.com/office/drawing/2016/5/13/chartex" xmlns:cx6="http://schemas.microsoft.com/office/drawing/2016/5/12/chartex" xmlns:cx5="http://schemas.microsoft.com/office/drawing/2016/5/11/chartex" xmlns:cx4="http://schemas.microsoft.com/office/drawing/2016/5/10/chartex" xmlns:cx3="http://schemas.microsoft.com/office/drawing/2016/5/9/chartex" xmlns:cx2="http://schemas.microsoft.com/office/drawing/2015/10/21/chartex" xmlns:cx1="http://schemas.microsoft.com/office/drawing/2015/9/8/chartex" xmlns:cx="http://schemas.microsoft.com/office/drawing/2014/chartex">
+          <mc:Fallback xmlns:cx="http://schemas.microsoft.com/office/drawing/2014/chartex" xmlns:cx1="http://schemas.microsoft.com/office/drawing/2015/9/8/chartex" xmlns:cx2="http://schemas.microsoft.com/office/drawing/2015/10/21/chartex" xmlns:cx3="http://schemas.microsoft.com/office/drawing/2016/5/9/chartex" xmlns:cx4="http://schemas.microsoft.com/office/drawing/2016/5/10/chartex" xmlns:cx5="http://schemas.microsoft.com/office/drawing/2016/5/11/chartex" xmlns:cx6="http://schemas.microsoft.com/office/drawing/2016/5/12/chartex" xmlns:cx7="http://schemas.microsoft.com/office/drawing/2016/5/13/chartex" xmlns:cx8="http://schemas.microsoft.com/office/drawing/2016/5/14/chartex" xmlns:aink="http://schemas.microsoft.com/office/drawing/2016/ink" xmlns:am3d="http://schemas.microsoft.com/office/drawing/2017/model3d" xmlns:w16cex="http://schemas.microsoft.com/office/word/2018/wordml/cex" xmlns:w16cid="http://schemas.microsoft.com/office/word/2016/wordml/cid" xmlns:w16="http://schemas.microsoft.com/office/word/2018/wordml" xmlns:w16sdtdh="http://schemas.microsoft.com/office/word/2020/wordml/sdtdatahash" xmlns:w16se="http://schemas.microsoft.com/office/word/2015/wordml/symex">
             <w:pict>
               <v:shape w14:anchorId="3999D40D" id="Flowchart: Alternate Process 31" o:spid="_x0000_s1031" type="#_x0000_t176" style="position:absolute;margin-left:-31.8pt;margin-top:17.5pt;width:100.55pt;height:20.7pt;rotation:-90;z-index:251701248;visibility:visible;mso-wrap-style:square;mso-width-percent:0;mso-height-percent:0;mso-wrap-distance-left:9pt;mso-wrap-distance-top:0;mso-wrap-distance-right:9pt;mso-wrap-distance-bottom:0;mso-position-horizontal:absolute;mso-position-horizontal-relative:text;mso-position-vertical:absolute;mso-position-vertical-relative:text;mso-width-percent:0;mso-height-percent:0;mso-width-relative:margin;mso-height-relative:margin;v-text-anchor:middle" o:gfxdata="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" fillcolor="#9cc2e5 [1944]" strokecolor="black [3213]" strokeweight="1pt">
                 <v:textbox>
@@ -964,7 +940,7 @@
               </wp:anchor>
             </w:drawing>
           </mc:Choice>
-          <mc:Fallback xmlns:w16se="http://schemas.microsoft.com/office/word/2015/wordml/symex" xmlns:w16sdtdh="http://schemas.microsoft.com/office/word/2020/wordml/sdtdatahash" xmlns:w16="http://schemas.microsoft.com/office/word/2018/wordml" xmlns:w16cid="http://schemas.microsoft.com/office/word/2016/wordml/cid" xmlns:w16cex="http://schemas.microsoft.com/office/word/2018/wordml/cex" xmlns:am3d="http://schemas.microsoft.com/office/drawing/2017/model3d" xmlns:aink="http://schemas.microsoft.com/office/drawing/2016/ink" xmlns:cx8="http://schemas.microsoft.com/office/drawing/2016/5/14/chartex" xmlns:cx7="http://schemas.microsoft.com/office/drawing/2016/5/13/chartex" xmlns:cx6="http://schemas.microsoft.com/office/drawing/2016/5/12/chartex" xmlns:cx5="http://schemas.microsoft.com/office/drawing/2016/5/11/chartex" xmlns:cx4="http://schemas.microsoft.com/office/drawing/2016/5/10/chartex" xmlns:cx3="http://schemas.microsoft.com/office/drawing/2016/5/9/chartex" xmlns:cx2="http://schemas.microsoft.com/office/drawing/2015/10/21/chartex" xmlns:cx1="http://schemas.microsoft.com/office/drawing/2015/9/8/chartex" xmlns:cx="http://schemas.microsoft.com/office/drawing/2014/chartex">
+          <mc:Fallback xmlns:cx="http://schemas.microsoft.com/office/drawing/2014/chartex" xmlns:cx1="http://schemas.microsoft.com/office/drawing/2015/9/8/chartex" xmlns:cx2="http://schemas.microsoft.com/office/drawing/2015/10/21/chartex" xmlns:cx3="http://schemas.microsoft.com/office/drawing/2016/5/9/chartex" xmlns:cx4="http://schemas.microsoft.com/office/drawing/2016/5/10/chartex" xmlns:cx5="http://schemas.microsoft.com/office/drawing/2016/5/11/chartex" xmlns:cx6="http://schemas.microsoft.com/office/drawing/2016/5/12/chartex" xmlns:cx7="http://schemas.microsoft.com/office/drawing/2016/5/13/chartex" xmlns:cx8="http://schemas.microsoft.com/office/drawing/2016/5/14/chartex" xmlns:aink="http://schemas.microsoft.com/office/drawing/2016/ink" xmlns:am3d="http://schemas.microsoft.com/office/drawing/2017/model3d" xmlns:w16cex="http://schemas.microsoft.com/office/word/2018/wordml/cex" xmlns:w16cid="http://schemas.microsoft.com/office/word/2016/wordml/cid" xmlns:w16="http://schemas.microsoft.com/office/word/2018/wordml" xmlns:w16sdtdh="http://schemas.microsoft.com/office/word/2020/wordml/sdtdatahash" xmlns:w16se="http://schemas.microsoft.com/office/word/2015/wordml/symex">
             <w:pict>
               <v:shapetype w14:anchorId="403063FB" id="_x0000_t32" coordsize="21600,21600" o:spt="32" o:oned="t" path="m,l21600,21600e" filled="f">
                 <v:path arrowok="t" fillok="f" o:connecttype="none"/>
@@ -1053,7 +1029,7 @@
               </wp:anchor>
             </w:drawing>
           </mc:Choice>
-          <mc:Fallback xmlns:w16se="http://schemas.microsoft.com/office/word/2015/wordml/symex" xmlns:w16sdtdh="http://schemas.microsoft.com/office/word/2020/wordml/sdtdatahash" xmlns:w16="http://schemas.microsoft.com/office/word/2018/wordml" xmlns:w16cid="http://schemas.microsoft.com/office/word/2016/wordml/cid" xmlns:w16cex="http://schemas.microsoft.com/office/word/2018/wordml/cex" xmlns:am3d="http://schemas.microsoft.com/office/drawing/2017/model3d" xmlns:aink="http://schemas.microsoft.com/office/drawing/2016/ink" xmlns:cx8="http://schemas.microsoft.com/office/drawing/2016/5/14/chartex" xmlns:cx7="http://schemas.microsoft.com/office/drawing/2016/5/13/chartex" xmlns:cx6="http://schemas.microsoft.com/office/drawing/2016/5/12/chartex" xmlns:cx5="http://schemas.microsoft.com/office/drawing/2016/5/11/chartex" xmlns:cx4="http://schemas.microsoft.com/office/drawing/2016/5/10/chartex" xmlns:cx3="http://schemas.microsoft.com/office/drawing/2016/5/9/chartex" xmlns:cx2="http://schemas.microsoft.com/office/drawing/2015/10/21/chartex" xmlns:cx1="http://schemas.microsoft.com/office/drawing/2015/9/8/chartex" xmlns:cx="http://schemas.microsoft.com/office/drawing/2014/chartex">
+          <mc:Fallback xmlns:cx="http://schemas.microsoft.com/office/drawing/2014/chartex" xmlns:cx1="http://schemas.microsoft.com/office/drawing/2015/9/8/chartex" xmlns:cx2="http://schemas.microsoft.com/office/drawing/2015/10/21/chartex" xmlns:cx3="http://schemas.microsoft.com/office/drawing/2016/5/9/chartex" xmlns:cx4="http://schemas.microsoft.com/office/drawing/2016/5/10/chartex" xmlns:cx5="http://schemas.microsoft.com/office/drawing/2016/5/11/chartex" xmlns:cx6="http://schemas.microsoft.com/office/drawing/2016/5/12/chartex" xmlns:cx7="http://schemas.microsoft.com/office/drawing/2016/5/13/chartex" xmlns:cx8="http://schemas.microsoft.com/office/drawing/2016/5/14/chartex" xmlns:aink="http://schemas.microsoft.com/office/drawing/2016/ink" xmlns:am3d="http://schemas.microsoft.com/office/drawing/2017/model3d" xmlns:w16cex="http://schemas.microsoft.com/office/word/2018/wordml/cex" xmlns:w16cid="http://schemas.microsoft.com/office/word/2016/wordml/cid" xmlns:w16="http://schemas.microsoft.com/office/word/2018/wordml" xmlns:w16sdtdh="http://schemas.microsoft.com/office/word/2020/wordml/sdtdatahash" xmlns:w16se="http://schemas.microsoft.com/office/word/2015/wordml/symex">
             <w:pict>
               <v:shape w14:anchorId="1134C668" id="Straight Arrow Connector 23" o:spid="_x0000_s1026" type="#_x0000_t32" style="position:absolute;margin-left:487.5pt;margin-top:10.45pt;width:0;height:85.55pt;z-index:251721728;visibility:visible;mso-wrap-style:square;mso-wrap-distance-left:9pt;mso-wrap-distance-top:0;mso-wrap-distance-right:9pt;mso-wrap-distance-bottom:0;mso-position-horizontal:absolute;mso-position-horizontal-relative:text;mso-position-vertical:absolute;mso-position-vertical-relative:text" o:gfxdata="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" strokecolor="black [3213]" strokeweight=".5pt">
                 <v:stroke endarrow="block" joinstyle="miter"/>
@@ -1123,7 +1099,7 @@
               </wp:anchor>
             </w:drawing>
           </mc:Choice>
-          <mc:Fallback xmlns:w16se="http://schemas.microsoft.com/office/word/2015/wordml/symex" xmlns:w16sdtdh="http://schemas.microsoft.com/office/word/2020/wordml/sdtdatahash" xmlns:w16="http://schemas.microsoft.com/office/word/2018/wordml" xmlns:w16cid="http://schemas.microsoft.com/office/word/2016/wordml/cid" xmlns:w16cex="http://schemas.microsoft.com/office/word/2018/wordml/cex" xmlns:am3d="http://schemas.microsoft.com/office/drawing/2017/model3d" xmlns:aink="http://schemas.microsoft.com/office/drawing/2016/ink" xmlns:cx8="http://schemas.microsoft.com/office/drawing/2016/5/14/chartex" xmlns:cx7="http://schemas.microsoft.com/office/drawing/2016/5/13/chartex" xmlns:cx6="http://schemas.microsoft.com/office/drawing/2016/5/12/chartex" xmlns:cx5="http://schemas.microsoft.com/office/drawing/2016/5/11/chartex" xmlns:cx4="http://schemas.microsoft.com/office/drawing/2016/5/10/chartex" xmlns:cx3="http://schemas.microsoft.com/office/drawing/2016/5/9/chartex" xmlns:cx2="http://schemas.microsoft.com/office/drawing/2015/10/21/chartex" xmlns:cx1="http://schemas.microsoft.com/office/drawing/2015/9/8/chartex" xmlns:cx="http://schemas.microsoft.com/office/drawing/2014/chartex">
+          <mc:Fallback xmlns:cx="http://schemas.microsoft.com/office/drawing/2014/chartex" xmlns:cx1="http://schemas.microsoft.com/office/drawing/2015/9/8/chartex" xmlns:cx2="http://schemas.microsoft.com/office/drawing/2015/10/21/chartex" xmlns:cx3="http://schemas.microsoft.com/office/drawing/2016/5/9/chartex" xmlns:cx4="http://schemas.microsoft.com/office/drawing/2016/5/10/chartex" xmlns:cx5="http://schemas.microsoft.com/office/drawing/2016/5/11/chartex" xmlns:cx6="http://schemas.microsoft.com/office/drawing/2016/5/12/chartex" xmlns:cx7="http://schemas.microsoft.com/office/drawing/2016/5/13/chartex" xmlns:cx8="http://schemas.microsoft.com/office/drawing/2016/5/14/chartex" xmlns:aink="http://schemas.microsoft.com/office/drawing/2016/ink" xmlns:am3d="http://schemas.microsoft.com/office/drawing/2017/model3d" xmlns:w16cex="http://schemas.microsoft.com/office/word/2018/wordml/cex" xmlns:w16cid="http://schemas.microsoft.com/office/word/2016/wordml/cid" xmlns:w16="http://schemas.microsoft.com/office/word/2018/wordml" xmlns:w16sdtdh="http://schemas.microsoft.com/office/word/2020/wordml/sdtdatahash" xmlns:w16se="http://schemas.microsoft.com/office/word/2015/wordml/symex">
             <w:pict>
               <v:shape w14:anchorId="029C70D5" id="Straight Arrow Connector 27" o:spid="_x0000_s1026" type="#_x0000_t32" style="position:absolute;margin-left:110.25pt;margin-top:10.15pt;width:0;height:22.15pt;z-index:251706368;visibility:visible;mso-wrap-style:square;mso-wrap-distance-left:9pt;mso-wrap-distance-top:0;mso-wrap-distance-right:9pt;mso-wrap-distance-bottom:0;mso-position-horizontal:absolute;mso-position-horizontal-relative:text;mso-position-vertical:absolute;mso-position-vertical-relative:text" o:gfxdata="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" strokecolor="black [3213]" strokeweight=".5pt">
                 <v:stroke endarrow="block" joinstyle="miter"/>
@@ -1142,6 +1118,166 @@
       <w:pPr>
         <w:spacing w:after="0" w:line="240" w:lineRule="auto"/>
       </w:pPr>
+      <w:r>
+        <w:rPr>
+          <w:noProof/>
+          <w:lang w:val="en-MY" w:eastAsia="en-MY"/>
+        </w:rPr>
+        <mc:AlternateContent>
+          <mc:Choice Requires="wps">
+            <w:drawing>
+              <wp:anchor distT="0" distB="0" distL="114300" distR="114300" simplePos="0" relativeHeight="251665408" behindDoc="0" locked="0" layoutInCell="1" allowOverlap="1" wp14:anchorId="4FF0996A" wp14:editId="5C3A5F6F">
+                <wp:simplePos x="0" y="0"/>
+                <wp:positionH relativeFrom="column">
+                  <wp:posOffset>3048000</wp:posOffset>
+                </wp:positionH>
+                <wp:positionV relativeFrom="paragraph">
+                  <wp:posOffset>75565</wp:posOffset>
+                </wp:positionV>
+                <wp:extent cx="1887220" cy="622300"/>
+                <wp:effectExtent l="0" t="0" r="17780" b="25400"/>
+                <wp:wrapNone/>
+                <wp:docPr id="4" name="Rectangle 4"/>
+                <wp:cNvGraphicFramePr/>
+                <a:graphic xmlns:a="http://schemas.openxmlformats.org/drawingml/2006/main">
+                  <a:graphicData uri="http://schemas.microsoft.com/office/word/2010/wordprocessingShape">
+                    <wps:wsp>
+                      <wps:cNvSpPr/>
+                      <wps:spPr>
+                        <a:xfrm>
+                          <a:off x="0" y="0"/>
+                          <a:ext cx="1887220" cy="622300"/>
+                        </a:xfrm>
+                        <a:prstGeom prst="rect">
+                          <a:avLst/>
+                        </a:prstGeom>
+                        <a:noFill/>
+                        <a:ln>
+                          <a:solidFill>
+                            <a:schemeClr val="tx1"/>
+                          </a:solidFill>
+                        </a:ln>
+                      </wps:spPr>
+                      <wps:style>
+                        <a:lnRef idx="2">
+                          <a:schemeClr val="accent1">
+                            <a:shade val="50000"/>
+                          </a:schemeClr>
+                        </a:lnRef>
+                        <a:fillRef idx="1">
+                          <a:schemeClr val="accent1"/>
+                        </a:fillRef>
+                        <a:effectRef idx="0">
+                          <a:schemeClr val="accent1"/>
+                        </a:effectRef>
+                        <a:fontRef idx="minor">
+                          <a:schemeClr val="lt1"/>
+                        </a:fontRef>
+                      </wps:style>
+                      <wps:txbx>
+                        <w:txbxContent>
+                          <w:p>
+                            <w:pPr>
+                              <w:jc w:val="center"/>
+                            </w:pPr>
+                            <w:r>
+                              <w:rPr>
+                                <w:rFonts w:ascii="Arial" w:hAnsi="Arial"/>
+                                <w:color w:val="000000"/>
+                                <w:sz w:val="15"/>
+                                <w:szCs w:val="15"/>
+                              </w:rPr>
+                              <w:t xml:space="preserve">Records excluded after screening, duplicate, scope, year-range, or access </w:t>
+                            </w:r>
+                            <w:r>
+                              <w:rPr>
+                                <w:rFonts w:ascii="Arial" w:hAnsi="Arial"/>
+                                <w:color w:val="000000"/>
+                                <w:sz w:val="15"/>
+                                <w:szCs w:val="15"/>
+                              </w:rPr>
+                              <w:t>checks</w:t>
+                            </w:r>
+                            <w:r>
+                              <w:br/>
+                            </w:r>
+                            <w:r>
+                              <w:rPr>
+                                <w:rFonts w:ascii="Arial" w:hAnsi="Arial"/>
+                                <w:color w:val="000000"/>
+                                <w:sz w:val="15"/>
+                                <w:szCs w:val="15"/>
+                              </w:rPr>
+                              <w:t>(n = 47)</w:t>
+                            </w:r>
+                          </w:p>
+                        </w:txbxContent>
+                      </wps:txbx>
+                      <wps:bodyPr rot="0" spcFirstLastPara="0" vertOverflow="overflow" horzOverflow="overflow" vert="horz" wrap="square" lIns="91440" tIns="45720" rIns="91440" bIns="45720" numCol="1" spcCol="0" rtlCol="0" fromWordArt="0" anchor="ctr" anchorCtr="0" forceAA="0" compatLnSpc="1">
+                        <a:prstTxWarp prst="textNoShape">
+                          <a:avLst/>
+                        </a:prstTxWarp>
+                        <a:noAutofit/>
+                      </wps:bodyPr>
+                    </wps:wsp>
+                  </a:graphicData>
+                </a:graphic>
+                <wp14:sizeRelH relativeFrom="margin">
+                  <wp14:pctWidth>0</wp14:pctWidth>
+                </wp14:sizeRelH>
+                <wp14:sizeRelV relativeFrom="margin">
+                  <wp14:pctHeight>0</wp14:pctHeight>
+                </wp14:sizeRelV>
+              </wp:anchor>
+            </w:drawing>
+          </mc:Choice>
+          <mc:Fallback>
+            <w:pict>
+              <v:rect w14:anchorId="4FF0996A" id="Rectangle 4" o:spid="_x0000_s1032" style="position:absolute;margin-left:240pt;margin-top:5.95pt;width:148.6pt;height:49pt;z-index:251665408;visibility:visible;mso-wrap-style:square;mso-width-percent:0;mso-height-percent:0;mso-wrap-distance-left:9pt;mso-wrap-distance-top:0;mso-wrap-distance-right:9pt;mso-wrap-distance-bottom:0;mso-position-horizontal:absolute;mso-position-horizontal-relative:text;mso-position-vertical:absolute;mso-position-vertical-relative:text;mso-width-percent:0;mso-height-percent:0;mso-width-relative:margin;mso-height-relative:margin;v-text-anchor:middle" o:gfxdata="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" filled="f" strokecolor="black [3213]" strokeweight="1pt">
+                <v:textbox>
+                  <w:txbxContent>
+                    <w:p>
+                      <w:pPr>
+                        <w:jc w:val="center"/>
+                      </w:pPr>
+                      <w:r>
+                        <w:rPr>
+                          <w:rFonts w:ascii="Arial" w:hAnsi="Arial"/>
+                          <w:color w:val="000000"/>
+                          <w:sz w:val="15"/>
+                          <w:szCs w:val="15"/>
+                        </w:rPr>
+                        <w:t xml:space="preserve">Records excluded after screening, duplicate, scope, year-range, or access </w:t>
+                      </w:r>
+                      <w:r>
+                        <w:rPr>
+                          <w:rFonts w:ascii="Arial" w:hAnsi="Arial"/>
+                          <w:color w:val="000000"/>
+                          <w:sz w:val="15"/>
+                          <w:szCs w:val="15"/>
+                        </w:rPr>
+                        <w:t>checks</w:t>
+                      </w:r>
+                      <w:r>
+                        <w:br/>
+                      </w:r>
+                      <w:r>
+                        <w:rPr>
+                          <w:rFonts w:ascii="Arial" w:hAnsi="Arial"/>
+                          <w:color w:val="000000"/>
+                          <w:sz w:val="15"/>
+                          <w:szCs w:val="15"/>
+                        </w:rPr>
+                        <w:t>(n = 47)</w:t>
+                      </w:r>
+                    </w:p>
+                  </w:txbxContent>
+                </v:textbox>
+              </v:rect>
+            </w:pict>
+          </mc:Fallback>
+        </mc:AlternateContent>
+      </w:r>
       <w:r>
         <w:rPr>
           <w:noProof/>
@@ -1203,7 +1339,7 @@
               </wp:anchor>
             </w:drawing>
           </mc:Choice>
-          <mc:Fallback xmlns:w16se="http://schemas.microsoft.com/office/word/2015/wordml/symex" xmlns:w16sdtdh="http://schemas.microsoft.com/office/word/2020/wordml/sdtdatahash" xmlns:w16="http://schemas.microsoft.com/office/word/2018/wordml" xmlns:w16cid="http://schemas.microsoft.com/office/word/2016/wordml/cid" xmlns:w16cex="http://schemas.microsoft.com/office/word/2018/wordml/cex" xmlns:am3d="http://schemas.microsoft.com/office/drawing/2017/model3d" xmlns:aink="http://schemas.microsoft.com/office/drawing/2016/ink" xmlns:cx8="http://schemas.microsoft.com/office/drawing/2016/5/14/chartex" xmlns:cx7="http://schemas.microsoft.com/office/drawing/2016/5/13/chartex" xmlns:cx6="http://schemas.microsoft.com/office/drawing/2016/5/12/chartex" xmlns:cx5="http://schemas.microsoft.com/office/drawing/2016/5/11/chartex" xmlns:cx4="http://schemas.microsoft.com/office/drawing/2016/5/10/chartex" xmlns:cx3="http://schemas.microsoft.com/office/drawing/2016/5/9/chartex" xmlns:cx2="http://schemas.microsoft.com/office/drawing/2015/10/21/chartex" xmlns:cx1="http://schemas.microsoft.com/office/drawing/2015/9/8/chartex" xmlns:cx="http://schemas.microsoft.com/office/drawing/2014/chartex">
+          <mc:Fallback xmlns:cx="http://schemas.microsoft.com/office/drawing/2014/chartex" xmlns:cx1="http://schemas.microsoft.com/office/drawing/2015/9/8/chartex" xmlns:cx2="http://schemas.microsoft.com/office/drawing/2015/10/21/chartex" xmlns:cx3="http://schemas.microsoft.com/office/drawing/2016/5/9/chartex" xmlns:cx4="http://schemas.microsoft.com/office/drawing/2016/5/10/chartex" xmlns:cx5="http://schemas.microsoft.com/office/drawing/2016/5/11/chartex" xmlns:cx6="http://schemas.microsoft.com/office/drawing/2016/5/12/chartex" xmlns:cx7="http://schemas.microsoft.com/office/drawing/2016/5/13/chartex" xmlns:cx8="http://schemas.microsoft.com/office/drawing/2016/5/14/chartex" xmlns:aink="http://schemas.microsoft.com/office/drawing/2016/ink" xmlns:am3d="http://schemas.microsoft.com/office/drawing/2017/model3d" xmlns:w16cex="http://schemas.microsoft.com/office/word/2018/wordml/cex" xmlns:w16cid="http://schemas.microsoft.com/office/word/2016/wordml/cid" xmlns:w16="http://schemas.microsoft.com/office/word/2018/wordml" xmlns:w16sdtdh="http://schemas.microsoft.com/office/word/2020/wordml/sdtdatahash" xmlns:w16se="http://schemas.microsoft.com/office/word/2015/wordml/symex">
             <w:pict>
               <v:shape w14:anchorId="3BE875AF" id="Straight Arrow Connector 15" o:spid="_x0000_s1026" type="#_x0000_t32" style="position:absolute;margin-left:193.2pt;margin-top:25.85pt;width:44.35pt;height:0;z-index:251681792;visibility:visible;mso-wrap-style:square;mso-wrap-distance-left:9pt;mso-wrap-distance-top:0;mso-wrap-distance-right:9pt;mso-wrap-distance-bottom:0;mso-position-horizontal:absolute;mso-position-horizontal-relative:text;mso-position-vertical:absolute;mso-position-vertical-relative:text" o:gfxdata="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" strokecolor="black [3213]" strokeweight=".5pt">
                 <v:stroke endarrow="block" joinstyle="miter"/>
@@ -1281,7 +1417,7 @@
                                 <w:sz w:val="15"/>
                                 <w:szCs w:val="15"/>
                               </w:rPr>
-                              <w:t>Records screened at title, abstract, and metadata level</w:t>
+                              <w:t>Records considered</w:t>
                             </w:r>
                             <w:r>
                               <w:br/>
@@ -1318,7 +1454,7 @@
           </mc:Choice>
           <mc:Fallback>
             <w:pict>
-              <v:rect w14:anchorId="4C37AEA5" id="Rectangle 3" o:spid="_x0000_s1032" style="position:absolute;margin-left:44.05pt;margin-top:5.9pt;width:148.6pt;height:41.45pt;z-index:251663360;visibility:visible;mso-wrap-style:square;mso-width-percent:0;mso-height-percent:0;mso-wrap-distance-left:9pt;mso-wrap-distance-top:0;mso-wrap-distance-right:9pt;mso-wrap-distance-bottom:0;mso-position-horizontal:absolute;mso-position-horizontal-relative:text;mso-position-vertical:absolute;mso-position-vertical-relative:text;mso-width-percent:0;mso-height-percent:0;mso-width-relative:margin;mso-height-relative:margin;v-text-anchor:middle" o:gfxdata="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" filled="f" strokecolor="black [3213]" strokeweight="1pt">
+              <v:rect w14:anchorId="4C37AEA5" id="Rectangle 3" o:spid="_x0000_s1033" style="position:absolute;margin-left:44.05pt;margin-top:5.9pt;width:148.6pt;height:41.45pt;z-index:251663360;visibility:visible;mso-wrap-style:square;mso-width-percent:0;mso-height-percent:0;mso-wrap-distance-left:9pt;mso-wrap-distance-top:0;mso-wrap-distance-right:9pt;mso-wrap-distance-bottom:0;mso-position-horizontal:absolute;mso-position-horizontal-relative:text;mso-position-vertical:absolute;mso-position-vertical-relative:text;mso-width-percent:0;mso-height-percent:0;mso-width-relative:margin;mso-height-relative:margin;v-text-anchor:middle" o:gfxdata="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" filled="f" strokecolor="black [3213]" strokeweight="1pt">
                 <v:textbox>
                   <w:txbxContent>
                     <w:p>
@@ -1332,7 +1468,7 @@
                           <w:sz w:val="15"/>
                           <w:szCs w:val="15"/>
                         </w:rPr>
-                        <w:t>Records screened at title, abstract, and metadata level</w:t>
+                        <w:t>Records considered</w:t>
                       </w:r>
                       <w:r>
                         <w:br/>
@@ -1345,148 +1481,6 @@
                           <w:szCs w:val="15"/>
                         </w:rPr>
                         <w:t>(n = 96)</w:t>
-                      </w:r>
-                    </w:p>
-                  </w:txbxContent>
-                </v:textbox>
-              </v:rect>
-            </w:pict>
-          </mc:Fallback>
-        </mc:AlternateContent>
-      </w:r>
-      <w:r>
-        <w:rPr>
-          <w:noProof/>
-          <w:lang w:val="en-MY" w:eastAsia="en-MY"/>
-        </w:rPr>
-        <mc:AlternateContent>
-          <mc:Choice Requires="wps">
-            <w:drawing>
-              <wp:anchor distT="0" distB="0" distL="114300" distR="114300" simplePos="0" relativeHeight="251665408" behindDoc="0" locked="0" layoutInCell="1" allowOverlap="1" wp14:anchorId="4FF0996A" wp14:editId="5C3A5F6F">
-                <wp:simplePos x="0" y="0"/>
-                <wp:positionH relativeFrom="column">
-                  <wp:posOffset>3048000</wp:posOffset>
-                </wp:positionH>
-                <wp:positionV relativeFrom="paragraph">
-                  <wp:posOffset>74930</wp:posOffset>
-                </wp:positionV>
-                <wp:extent cx="1887220" cy="526415"/>
-                <wp:effectExtent l="0" t="0" r="17780" b="26035"/>
-                <wp:wrapNone/>
-                <wp:docPr id="4" name="Rectangle 4"/>
-                <wp:cNvGraphicFramePr/>
-                <a:graphic xmlns:a="http://schemas.openxmlformats.org/drawingml/2006/main">
-                  <a:graphicData uri="http://schemas.microsoft.com/office/word/2010/wordprocessingShape">
-                    <wps:wsp>
-                      <wps:cNvSpPr/>
-                      <wps:spPr>
-                        <a:xfrm>
-                          <a:off x="0" y="0"/>
-                          <a:ext cx="1887220" cy="526415"/>
-                        </a:xfrm>
-                        <a:prstGeom prst="rect">
-                          <a:avLst/>
-                        </a:prstGeom>
-                        <a:noFill/>
-                        <a:ln>
-                          <a:solidFill>
-                            <a:schemeClr val="tx1"/>
-                          </a:solidFill>
-                        </a:ln>
-                      </wps:spPr>
-                      <wps:style>
-                        <a:lnRef idx="2">
-                          <a:schemeClr val="accent1">
-                            <a:shade val="50000"/>
-                          </a:schemeClr>
-                        </a:lnRef>
-                        <a:fillRef idx="1">
-                          <a:schemeClr val="accent1"/>
-                        </a:fillRef>
-                        <a:effectRef idx="0">
-                          <a:schemeClr val="accent1"/>
-                        </a:effectRef>
-                        <a:fontRef idx="minor">
-                          <a:schemeClr val="lt1"/>
-                        </a:fontRef>
-                      </wps:style>
-                      <wps:txbx>
-                        <w:txbxContent>
-                          <w:p>
-                            <w:pPr>
-                              <w:jc w:val="center"/>
-                            </w:pPr>
-                            <w:r>
-                              <w:rPr>
-                                <w:rFonts w:ascii="Arial" w:hAnsi="Arial"/>
-                                <w:color w:val="000000"/>
-                                <w:sz w:val="15"/>
-                                <w:szCs w:val="15"/>
-                              </w:rPr>
-                              <w:t>Records excluded after screening, year-range, duplicate, scope, or access updates</w:t>
-                            </w:r>
-                            <w:r>
-                              <w:br/>
-                            </w:r>
-                            <w:r>
-                              <w:rPr>
-                                <w:rFonts w:ascii="Arial" w:hAnsi="Arial"/>
-                                <w:color w:val="000000"/>
-                                <w:sz w:val="15"/>
-                                <w:szCs w:val="15"/>
-                              </w:rPr>
-                              <w:t>(n = 47)</w:t>
-                            </w:r>
-                          </w:p>
-                        </w:txbxContent>
-                      </wps:txbx>
-                      <wps:bodyPr rot="0" spcFirstLastPara="0" vertOverflow="overflow" horzOverflow="overflow" vert="horz" wrap="square" lIns="91440" tIns="45720" rIns="91440" bIns="45720" numCol="1" spcCol="0" rtlCol="0" fromWordArt="0" anchor="ctr" anchorCtr="0" forceAA="0" compatLnSpc="1">
-                        <a:prstTxWarp prst="textNoShape">
-                          <a:avLst/>
-                        </a:prstTxWarp>
-                        <a:noAutofit/>
-                      </wps:bodyPr>
-                    </wps:wsp>
-                  </a:graphicData>
-                </a:graphic>
-                <wp14:sizeRelH relativeFrom="margin">
-                  <wp14:pctWidth>0</wp14:pctWidth>
-                </wp14:sizeRelH>
-                <wp14:sizeRelV relativeFrom="margin">
-                  <wp14:pctHeight>0</wp14:pctHeight>
-                </wp14:sizeRelV>
-              </wp:anchor>
-            </w:drawing>
-          </mc:Choice>
-          <mc:Fallback>
-            <w:pict>
-              <v:rect w14:anchorId="4FF0996A" id="Rectangle 4" o:spid="_x0000_s1033" style="position:absolute;margin-left:240pt;margin-top:5.9pt;width:148.6pt;height:41.45pt;z-index:251665408;visibility:visible;mso-wrap-style:square;mso-width-percent:0;mso-height-percent:0;mso-wrap-distance-left:9pt;mso-wrap-distance-top:0;mso-wrap-distance-right:9pt;mso-wrap-distance-bottom:0;mso-position-horizontal:absolute;mso-position-horizontal-relative:text;mso-position-vertical:absolute;mso-position-vertical-relative:text;mso-width-percent:0;mso-height-percent:0;mso-width-relative:margin;mso-height-relative:margin;v-text-anchor:middle" o:gfxdata="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" filled="f" strokecolor="black [3213]" strokeweight="1pt">
-                <v:textbox>
-                  <w:txbxContent>
-                    <w:p>
-                      <w:pPr>
-                        <w:jc w:val="center"/>
-                      </w:pPr>
-                      <w:r>
-                        <w:rPr>
-                          <w:rFonts w:ascii="Arial" w:hAnsi="Arial"/>
-                          <w:color w:val="000000"/>
-                          <w:sz w:val="15"/>
-                          <w:szCs w:val="15"/>
-                        </w:rPr>
-                        <w:t>Records excluded after screening, year-range, duplicate, scope, or access updates</w:t>
-                      </w:r>
-                      <w:r>
-                        <w:br/>
-                      </w:r>
-                      <w:r>
-                        <w:rPr>
-                          <w:rFonts w:ascii="Arial" w:hAnsi="Arial"/>
-                          <w:color w:val="000000"/>
-                          <w:sz w:val="15"/>
-                          <w:szCs w:val="15"/>
-                        </w:rPr>
-                        <w:t>(n = 47)</w:t>
                       </w:r>
                     </w:p>
                   </w:txbxContent>
@@ -1572,7 +1566,7 @@
               </wp:anchor>
             </w:drawing>
           </mc:Choice>
-          <mc:Fallback xmlns:w16se="http://schemas.microsoft.com/office/word/2015/wordml/symex" xmlns:w16sdtdh="http://schemas.microsoft.com/office/word/2020/wordml/sdtdatahash" xmlns:w16="http://schemas.microsoft.com/office/word/2018/wordml" xmlns:w16cid="http://schemas.microsoft.com/office/word/2016/wordml/cid" xmlns:w16cex="http://schemas.microsoft.com/office/word/2018/wordml/cex" xmlns:am3d="http://schemas.microsoft.com/office/drawing/2017/model3d" xmlns:aink="http://schemas.microsoft.com/office/drawing/2016/ink" xmlns:cx8="http://schemas.microsoft.com/office/drawing/2016/5/14/chartex" xmlns:cx7="http://schemas.microsoft.com/office/drawing/2016/5/13/chartex" xmlns:cx6="http://schemas.microsoft.com/office/drawing/2016/5/12/chartex" xmlns:cx5="http://schemas.microsoft.com/office/drawing/2016/5/11/chartex" xmlns:cx4="http://schemas.microsoft.com/office/drawing/2016/5/10/chartex" xmlns:cx3="http://schemas.microsoft.com/office/drawing/2016/5/9/chartex" xmlns:cx2="http://schemas.microsoft.com/office/drawing/2015/10/21/chartex" xmlns:cx1="http://schemas.microsoft.com/office/drawing/2015/9/8/chartex" xmlns:cx="http://schemas.microsoft.com/office/drawing/2014/chartex">
+          <mc:Fallback xmlns:cx="http://schemas.microsoft.com/office/drawing/2014/chartex" xmlns:cx1="http://schemas.microsoft.com/office/drawing/2015/9/8/chartex" xmlns:cx2="http://schemas.microsoft.com/office/drawing/2015/10/21/chartex" xmlns:cx3="http://schemas.microsoft.com/office/drawing/2016/5/9/chartex" xmlns:cx4="http://schemas.microsoft.com/office/drawing/2016/5/10/chartex" xmlns:cx5="http://schemas.microsoft.com/office/drawing/2016/5/11/chartex" xmlns:cx6="http://schemas.microsoft.com/office/drawing/2016/5/12/chartex" xmlns:cx7="http://schemas.microsoft.com/office/drawing/2016/5/13/chartex" xmlns:cx8="http://schemas.microsoft.com/office/drawing/2016/5/14/chartex" xmlns:aink="http://schemas.microsoft.com/office/drawing/2016/ink" xmlns:am3d="http://schemas.microsoft.com/office/drawing/2017/model3d" xmlns:w16cex="http://schemas.microsoft.com/office/word/2018/wordml/cex" xmlns:w16cid="http://schemas.microsoft.com/office/word/2016/wordml/cid" xmlns:w16="http://schemas.microsoft.com/office/word/2018/wordml" xmlns:w16sdtdh="http://schemas.microsoft.com/office/word/2020/wordml/sdtdatahash" xmlns:w16se="http://schemas.microsoft.com/office/word/2015/wordml/symex">
             <w:pict>
               <v:shape w14:anchorId="4664B787" id="Straight Arrow Connector 35" o:spid="_x0000_s1026" type="#_x0000_t32" style="position:absolute;margin-left:110.25pt;margin-top:7.85pt;width:0;height:22.15pt;z-index:251708416;visibility:visible;mso-wrap-style:square;mso-wrap-distance-left:9pt;mso-wrap-distance-top:0;mso-wrap-distance-right:9pt;mso-wrap-distance-bottom:0;mso-position-horizontal:absolute;mso-position-horizontal-relative:text;mso-position-vertical:absolute;mso-position-vertical-relative:text" o:gfxdata="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" strokecolor="black [3213]" strokeweight=".5pt">
                 <v:stroke endarrow="block" joinstyle="miter"/>
@@ -1587,6 +1581,8 @@
         <w:spacing w:after="0" w:line="240" w:lineRule="auto"/>
       </w:pPr>
     </w:p>
+    <w:bookmarkStart w:id="0" w:name="_GoBack"/>
+    <w:bookmarkEnd w:id="0"/>
     <w:p>
       <w:pPr>
         <w:spacing w:after="0" w:line="240" w:lineRule="auto"/>
@@ -1660,7 +1656,7 @@
                                 <w:sz w:val="15"/>
                                 <w:szCs w:val="15"/>
                               </w:rPr>
-                              <w:t>Phase 7 metadata-only records pending full-text download</w:t>
+                              <w:t>Eligible backup records not cited in current draft</w:t>
                             </w:r>
                             <w:r>
                               <w:br/>
@@ -1672,7 +1668,7 @@
                                 <w:sz w:val="15"/>
                                 <w:szCs w:val="15"/>
                               </w:rPr>
-                              <w:t>(n = 25)</w:t>
+                              <w:t>(n = 14)</w:t>
                             </w:r>
                           </w:p>
                         </w:txbxContent>
@@ -1695,7 +1691,7 @@
               </wp:anchor>
             </w:drawing>
           </mc:Choice>
-          <mc:Fallback xmlns:w16se="http://schemas.microsoft.com/office/word/2015/wordml/symex" xmlns:w16sdtdh="http://schemas.microsoft.com/office/word/2020/wordml/sdtdatahash" xmlns:w16="http://schemas.microsoft.com/office/word/2018/wordml" xmlns:w16cid="http://schemas.microsoft.com/office/word/2016/wordml/cid" xmlns:w16cex="http://schemas.microsoft.com/office/word/2018/wordml/cex" xmlns:am3d="http://schemas.microsoft.com/office/drawing/2017/model3d" xmlns:aink="http://schemas.microsoft.com/office/drawing/2016/ink" xmlns:cx8="http://schemas.microsoft.com/office/drawing/2016/5/14/chartex" xmlns:cx7="http://schemas.microsoft.com/office/drawing/2016/5/13/chartex" xmlns:cx6="http://schemas.microsoft.com/office/drawing/2016/5/12/chartex" xmlns:cx5="http://schemas.microsoft.com/office/drawing/2016/5/11/chartex" xmlns:cx4="http://schemas.microsoft.com/office/drawing/2016/5/10/chartex" xmlns:cx3="http://schemas.microsoft.com/office/drawing/2016/5/9/chartex" xmlns:cx2="http://schemas.microsoft.com/office/drawing/2015/10/21/chartex" xmlns:cx1="http://schemas.microsoft.com/office/drawing/2015/9/8/chartex" xmlns:cx="http://schemas.microsoft.com/office/drawing/2014/chartex">
+          <mc:Fallback xmlns:cx="http://schemas.microsoft.com/office/drawing/2014/chartex" xmlns:cx1="http://schemas.microsoft.com/office/drawing/2015/9/8/chartex" xmlns:cx2="http://schemas.microsoft.com/office/drawing/2015/10/21/chartex" xmlns:cx3="http://schemas.microsoft.com/office/drawing/2016/5/9/chartex" xmlns:cx4="http://schemas.microsoft.com/office/drawing/2016/5/10/chartex" xmlns:cx5="http://schemas.microsoft.com/office/drawing/2016/5/11/chartex" xmlns:cx6="http://schemas.microsoft.com/office/drawing/2016/5/12/chartex" xmlns:cx7="http://schemas.microsoft.com/office/drawing/2016/5/13/chartex" xmlns:cx8="http://schemas.microsoft.com/office/drawing/2016/5/14/chartex" xmlns:aink="http://schemas.microsoft.com/office/drawing/2016/ink" xmlns:am3d="http://schemas.microsoft.com/office/drawing/2017/model3d" xmlns:w16cex="http://schemas.microsoft.com/office/word/2018/wordml/cex" xmlns:w16cid="http://schemas.microsoft.com/office/word/2016/wordml/cid" xmlns:w16="http://schemas.microsoft.com/office/word/2018/wordml" xmlns:w16sdtdh="http://schemas.microsoft.com/office/word/2020/wordml/sdtdatahash" xmlns:w16se="http://schemas.microsoft.com/office/word/2015/wordml/symex">
             <w:pict>
               <v:rect w14:anchorId="1725A8EE" id="Rectangle 20" o:spid="_x0000_s1034" style="position:absolute;margin-left:610.45pt;margin-top:4.95pt;width:148.6pt;height:41.45pt;z-index:251717632;visibility:visible;mso-wrap-style:square;mso-width-percent:0;mso-height-percent:0;mso-wrap-distance-left:9pt;mso-wrap-distance-top:0;mso-wrap-distance-right:9pt;mso-wrap-distance-bottom:0;mso-position-horizontal:absolute;mso-position-horizontal-relative:text;mso-position-vertical:absolute;mso-position-vertical-relative:text;mso-width-percent:0;mso-height-percent:0;mso-width-relative:margin;mso-height-relative:margin;v-text-anchor:middle" o:gfxdata="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" filled="f" strokecolor="black [3213]" strokeweight="1pt">
                 <v:textbox>
@@ -1711,7 +1707,7 @@
                           <w:sz w:val="15"/>
                           <w:szCs w:val="15"/>
                         </w:rPr>
-                        <w:t>Phase 7 metadata-only records pending full-text download</w:t>
+                        <w:t>Eligible backup records not cited in current draft</w:t>
                       </w:r>
                       <w:r>
                         <w:br/>
@@ -1723,7 +1719,7 @@
                           <w:sz w:val="15"/>
                           <w:szCs w:val="15"/>
                         </w:rPr>
-                        <w:t>(n = 25)</w:t>
+                        <w:t>(n = 14)</w:t>
                       </w:r>
                     </w:p>
                   </w:txbxContent>
@@ -1802,7 +1798,7 @@
                                 <w:sz w:val="15"/>
                                 <w:szCs w:val="15"/>
                               </w:rPr>
-                              <w:t>Records with full-text/access screening documented</w:t>
+                              <w:t>Eligible records after screening</w:t>
                             </w:r>
                             <w:r>
                               <w:br/>
@@ -1814,7 +1810,7 @@
                                 <w:sz w:val="15"/>
                                 <w:szCs w:val="15"/>
                               </w:rPr>
-                              <w:t>(n = 71)</w:t>
+                              <w:t>(n = 49)</w:t>
                             </w:r>
                           </w:p>
                         </w:txbxContent>
@@ -1837,7 +1833,7 @@
               </wp:anchor>
             </w:drawing>
           </mc:Choice>
-          <mc:Fallback xmlns:w16se="http://schemas.microsoft.com/office/word/2015/wordml/symex" xmlns:w16sdtdh="http://schemas.microsoft.com/office/word/2020/wordml/sdtdatahash" xmlns:w16="http://schemas.microsoft.com/office/word/2018/wordml" xmlns:w16cid="http://schemas.microsoft.com/office/word/2016/wordml/cid" xmlns:w16cex="http://schemas.microsoft.com/office/word/2018/wordml/cex" xmlns:am3d="http://schemas.microsoft.com/office/drawing/2017/model3d" xmlns:aink="http://schemas.microsoft.com/office/drawing/2016/ink" xmlns:cx8="http://schemas.microsoft.com/office/drawing/2016/5/14/chartex" xmlns:cx7="http://schemas.microsoft.com/office/drawing/2016/5/13/chartex" xmlns:cx6="http://schemas.microsoft.com/office/drawing/2016/5/12/chartex" xmlns:cx5="http://schemas.microsoft.com/office/drawing/2016/5/11/chartex" xmlns:cx4="http://schemas.microsoft.com/office/drawing/2016/5/10/chartex" xmlns:cx3="http://schemas.microsoft.com/office/drawing/2016/5/9/chartex" xmlns:cx2="http://schemas.microsoft.com/office/drawing/2015/10/21/chartex" xmlns:cx1="http://schemas.microsoft.com/office/drawing/2015/9/8/chartex" xmlns:cx="http://schemas.microsoft.com/office/drawing/2014/chartex">
+          <mc:Fallback xmlns:cx="http://schemas.microsoft.com/office/drawing/2014/chartex" xmlns:cx1="http://schemas.microsoft.com/office/drawing/2015/9/8/chartex" xmlns:cx2="http://schemas.microsoft.com/office/drawing/2015/10/21/chartex" xmlns:cx3="http://schemas.microsoft.com/office/drawing/2016/5/9/chartex" xmlns:cx4="http://schemas.microsoft.com/office/drawing/2016/5/10/chartex" xmlns:cx5="http://schemas.microsoft.com/office/drawing/2016/5/11/chartex" xmlns:cx6="http://schemas.microsoft.com/office/drawing/2016/5/12/chartex" xmlns:cx7="http://schemas.microsoft.com/office/drawing/2016/5/13/chartex" xmlns:cx8="http://schemas.microsoft.com/office/drawing/2016/5/14/chartex" xmlns:aink="http://schemas.microsoft.com/office/drawing/2016/ink" xmlns:am3d="http://schemas.microsoft.com/office/drawing/2017/model3d" xmlns:w16cex="http://schemas.microsoft.com/office/word/2018/wordml/cex" xmlns:w16cid="http://schemas.microsoft.com/office/word/2016/wordml/cid" xmlns:w16="http://schemas.microsoft.com/office/word/2018/wordml" xmlns:w16sdtdh="http://schemas.microsoft.com/office/word/2020/wordml/sdtdatahash" xmlns:w16se="http://schemas.microsoft.com/office/word/2015/wordml/symex">
             <w:pict>
               <v:rect w14:anchorId="7F3CCFC8" id="Rectangle 7" o:spid="_x0000_s1035" style="position:absolute;margin-left:415pt;margin-top:4.45pt;width:148.6pt;height:41.45pt;z-index:251716608;visibility:visible;mso-wrap-style:square;mso-width-percent:0;mso-height-percent:0;mso-wrap-distance-left:9pt;mso-wrap-distance-top:0;mso-wrap-distance-right:9pt;mso-wrap-distance-bottom:0;mso-position-horizontal:absolute;mso-position-horizontal-relative:text;mso-position-vertical:absolute;mso-position-vertical-relative:text;mso-width-percent:0;mso-height-percent:0;mso-width-relative:margin;mso-height-relative:margin;v-text-anchor:middle" o:gfxdata="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" filled="f" strokecolor="black [3213]" strokeweight="1pt">
                 <v:textbox>
@@ -1853,7 +1849,7 @@
                           <w:sz w:val="15"/>
                           <w:szCs w:val="15"/>
                         </w:rPr>
-                        <w:t>Records with full-text/access screening documented</w:t>
+                        <w:t>Eligible records after screening</w:t>
                       </w:r>
                       <w:r>
                         <w:br/>
@@ -1865,7 +1861,7 @@
                           <w:sz w:val="15"/>
                           <w:szCs w:val="15"/>
                         </w:rPr>
-                        <w:t>(n = 71)</w:t>
+                        <w:t>(n = 49)</w:t>
                       </w:r>
                     </w:p>
                   </w:txbxContent>
@@ -1944,7 +1940,7 @@
                                 <w:sz w:val="15"/>
                                 <w:szCs w:val="15"/>
                               </w:rPr>
-                              <w:t>Records with full-text/access screening documented</w:t>
+                              <w:t>Eligible records after screening</w:t>
                             </w:r>
                             <w:r>
                               <w:br/>
@@ -1956,7 +1952,7 @@
                                 <w:sz w:val="15"/>
                                 <w:szCs w:val="15"/>
                               </w:rPr>
-                              <w:t>(n = 71)</w:t>
+                              <w:t>(n = 49)</w:t>
                             </w:r>
                           </w:p>
                         </w:txbxContent>
@@ -1995,7 +1991,7 @@
                           <w:sz w:val="15"/>
                           <w:szCs w:val="15"/>
                         </w:rPr>
-                        <w:t>Records with full-text/access screening documented</w:t>
+                        <w:t>Eligible records after screening</w:t>
                       </w:r>
                       <w:r>
                         <w:br/>
@@ -2007,7 +2003,7 @@
                           <w:sz w:val="15"/>
                           <w:szCs w:val="15"/>
                         </w:rPr>
-                        <w:t>(n = 71)</w:t>
+                        <w:t>(n = 49)</w:t>
                       </w:r>
                     </w:p>
                   </w:txbxContent>
@@ -2078,7 +2074,7 @@
               </wp:anchor>
             </w:drawing>
           </mc:Choice>
-          <mc:Fallback xmlns:w16se="http://schemas.microsoft.com/office/word/2015/wordml/symex" xmlns:w16sdtdh="http://schemas.microsoft.com/office/word/2020/wordml/sdtdatahash" xmlns:w16="http://schemas.microsoft.com/office/word/2018/wordml" xmlns:w16cid="http://schemas.microsoft.com/office/word/2016/wordml/cid" xmlns:w16cex="http://schemas.microsoft.com/office/word/2018/wordml/cex" xmlns:am3d="http://schemas.microsoft.com/office/drawing/2017/model3d" xmlns:aink="http://schemas.microsoft.com/office/drawing/2016/ink" xmlns:cx8="http://schemas.microsoft.com/office/drawing/2016/5/14/chartex" xmlns:cx7="http://schemas.microsoft.com/office/drawing/2016/5/13/chartex" xmlns:cx6="http://schemas.microsoft.com/office/drawing/2016/5/12/chartex" xmlns:cx5="http://schemas.microsoft.com/office/drawing/2016/5/11/chartex" xmlns:cx4="http://schemas.microsoft.com/office/drawing/2016/5/10/chartex" xmlns:cx3="http://schemas.microsoft.com/office/drawing/2016/5/9/chartex" xmlns:cx2="http://schemas.microsoft.com/office/drawing/2015/10/21/chartex" xmlns:cx1="http://schemas.microsoft.com/office/drawing/2015/9/8/chartex" xmlns:cx="http://schemas.microsoft.com/office/drawing/2014/chartex">
+          <mc:Fallback xmlns:cx="http://schemas.microsoft.com/office/drawing/2014/chartex" xmlns:cx1="http://schemas.microsoft.com/office/drawing/2015/9/8/chartex" xmlns:cx2="http://schemas.microsoft.com/office/drawing/2015/10/21/chartex" xmlns:cx3="http://schemas.microsoft.com/office/drawing/2016/5/9/chartex" xmlns:cx4="http://schemas.microsoft.com/office/drawing/2016/5/10/chartex" xmlns:cx5="http://schemas.microsoft.com/office/drawing/2016/5/11/chartex" xmlns:cx6="http://schemas.microsoft.com/office/drawing/2016/5/12/chartex" xmlns:cx7="http://schemas.microsoft.com/office/drawing/2016/5/13/chartex" xmlns:cx8="http://schemas.microsoft.com/office/drawing/2016/5/14/chartex" xmlns:aink="http://schemas.microsoft.com/office/drawing/2016/ink" xmlns:am3d="http://schemas.microsoft.com/office/drawing/2017/model3d" xmlns:w16cex="http://schemas.microsoft.com/office/word/2018/wordml/cex" xmlns:w16cid="http://schemas.microsoft.com/office/word/2016/wordml/cid" xmlns:w16="http://schemas.microsoft.com/office/word/2018/wordml" xmlns:w16sdtdh="http://schemas.microsoft.com/office/word/2020/wordml/sdtdatahash" xmlns:w16se="http://schemas.microsoft.com/office/word/2015/wordml/symex">
             <w:pict>
               <v:shape w14:anchorId="2023F88D" id="Straight Arrow Connector 16" o:spid="_x0000_s1026" type="#_x0000_t32" style="position:absolute;margin-left:193.95pt;margin-top:25.25pt;width:44.35pt;height:0;z-index:251683840;visibility:visible;mso-wrap-style:square;mso-wrap-distance-left:9pt;mso-wrap-distance-top:0;mso-wrap-distance-right:9pt;mso-wrap-distance-bottom:0;mso-position-horizontal:absolute;mso-position-horizontal-relative:text;mso-position-vertical:absolute;mso-position-vertical-relative:text" o:gfxdata="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" strokecolor="black [3213]" strokeweight=".5pt">
                 <v:stroke endarrow="block" joinstyle="miter"/>
@@ -2156,7 +2152,7 @@
                                 <w:sz w:val="15"/>
                                 <w:szCs w:val="15"/>
                               </w:rPr>
-                              <w:t>Full text unavailable / not retrieved</w:t>
+                              <w:t>Eligible backup records not cited in current draft</w:t>
                             </w:r>
                             <w:r>
                               <w:br/>
@@ -2168,7 +2164,7 @@
                                 <w:sz w:val="15"/>
                                 <w:szCs w:val="15"/>
                               </w:rPr>
-                              <w:t>(n = 33)</w:t>
+                              <w:t>(n = 14)</w:t>
                             </w:r>
                           </w:p>
                         </w:txbxContent>
@@ -2207,7 +2203,7 @@
                           <w:sz w:val="15"/>
                           <w:szCs w:val="15"/>
                         </w:rPr>
-                        <w:t>Full text unavailable / not retrieved</w:t>
+                        <w:t>Eligible backup records not cited in current draft</w:t>
                       </w:r>
                       <w:r>
                         <w:br/>
@@ -2219,7 +2215,7 @@
                           <w:sz w:val="15"/>
                           <w:szCs w:val="15"/>
                         </w:rPr>
-                        <w:t>(n = 33)</w:t>
+                        <w:t>(n = 14)</w:t>
                       </w:r>
                     </w:p>
                   </w:txbxContent>
@@ -2295,7 +2291,7 @@
               </wp:anchor>
             </w:drawing>
           </mc:Choice>
-          <mc:Fallback xmlns:w16se="http://schemas.microsoft.com/office/word/2015/wordml/symex" xmlns:w16sdtdh="http://schemas.microsoft.com/office/word/2020/wordml/sdtdatahash" xmlns:w16="http://schemas.microsoft.com/office/word/2018/wordml" xmlns:w16cid="http://schemas.microsoft.com/office/word/2016/wordml/cid" xmlns:w16cex="http://schemas.microsoft.com/office/word/2018/wordml/cex" xmlns:am3d="http://schemas.microsoft.com/office/drawing/2017/model3d" xmlns:aink="http://schemas.microsoft.com/office/drawing/2016/ink" xmlns:cx8="http://schemas.microsoft.com/office/drawing/2016/5/14/chartex" xmlns:cx7="http://schemas.microsoft.com/office/drawing/2016/5/13/chartex" xmlns:cx6="http://schemas.microsoft.com/office/drawing/2016/5/12/chartex" xmlns:cx5="http://schemas.microsoft.com/office/drawing/2016/5/11/chartex" xmlns:cx4="http://schemas.microsoft.com/office/drawing/2016/5/10/chartex" xmlns:cx3="http://schemas.microsoft.com/office/drawing/2016/5/9/chartex" xmlns:cx2="http://schemas.microsoft.com/office/drawing/2015/10/21/chartex" xmlns:cx1="http://schemas.microsoft.com/office/drawing/2015/9/8/chartex" xmlns:cx="http://schemas.microsoft.com/office/drawing/2014/chartex">
+          <mc:Fallback xmlns:cx="http://schemas.microsoft.com/office/drawing/2014/chartex" xmlns:cx1="http://schemas.microsoft.com/office/drawing/2015/9/8/chartex" xmlns:cx2="http://schemas.microsoft.com/office/drawing/2015/10/21/chartex" xmlns:cx3="http://schemas.microsoft.com/office/drawing/2016/5/9/chartex" xmlns:cx4="http://schemas.microsoft.com/office/drawing/2016/5/10/chartex" xmlns:cx5="http://schemas.microsoft.com/office/drawing/2016/5/11/chartex" xmlns:cx6="http://schemas.microsoft.com/office/drawing/2016/5/12/chartex" xmlns:cx7="http://schemas.microsoft.com/office/drawing/2016/5/13/chartex" xmlns:cx8="http://schemas.microsoft.com/office/drawing/2016/5/14/chartex" xmlns:aink="http://schemas.microsoft.com/office/drawing/2016/ink" xmlns:am3d="http://schemas.microsoft.com/office/drawing/2017/model3d" xmlns:w16cex="http://schemas.microsoft.com/office/word/2018/wordml/cex" xmlns:w16cid="http://schemas.microsoft.com/office/word/2016/wordml/cid" xmlns:w16="http://schemas.microsoft.com/office/word/2018/wordml" xmlns:w16sdtdh="http://schemas.microsoft.com/office/word/2020/wordml/sdtdatahash" xmlns:w16se="http://schemas.microsoft.com/office/word/2015/wordml/symex">
             <w:pict>
               <v:shape w14:anchorId="0F158985" id="Straight Arrow Connector 21" o:spid="_x0000_s1026" type="#_x0000_t32" style="position:absolute;margin-left:564.8pt;margin-top:12.55pt;width:44.35pt;height:0;z-index:251718656;visibility:visible;mso-wrap-style:square;mso-wrap-distance-left:9pt;mso-wrap-distance-top:0;mso-wrap-distance-right:9pt;mso-wrap-distance-bottom:0;mso-position-horizontal:absolute;mso-position-horizontal-relative:text;mso-position-vertical:absolute;mso-position-vertical-relative:text" o:gfxdata="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" strokecolor="black [3213]" strokeweight=".5pt">
                 <v:stroke endarrow="block" joinstyle="miter"/>
@@ -2407,7 +2403,7 @@
               </wp:anchor>
             </w:drawing>
           </mc:Choice>
-          <mc:Fallback xmlns:w16se="http://schemas.microsoft.com/office/word/2015/wordml/symex" xmlns:w16sdtdh="http://schemas.microsoft.com/office/word/2020/wordml/sdtdatahash" xmlns:w16="http://schemas.microsoft.com/office/word/2018/wordml" xmlns:w16cid="http://schemas.microsoft.com/office/word/2016/wordml/cid" xmlns:w16cex="http://schemas.microsoft.com/office/word/2018/wordml/cex" xmlns:am3d="http://schemas.microsoft.com/office/drawing/2017/model3d" xmlns:aink="http://schemas.microsoft.com/office/drawing/2016/ink" xmlns:cx8="http://schemas.microsoft.com/office/drawing/2016/5/14/chartex" xmlns:cx7="http://schemas.microsoft.com/office/drawing/2016/5/13/chartex" xmlns:cx6="http://schemas.microsoft.com/office/drawing/2016/5/12/chartex" xmlns:cx5="http://schemas.microsoft.com/office/drawing/2016/5/11/chartex" xmlns:cx4="http://schemas.microsoft.com/office/drawing/2016/5/10/chartex" xmlns:cx3="http://schemas.microsoft.com/office/drawing/2016/5/9/chartex" xmlns:cx2="http://schemas.microsoft.com/office/drawing/2015/10/21/chartex" xmlns:cx1="http://schemas.microsoft.com/office/drawing/2015/9/8/chartex" xmlns:cx="http://schemas.microsoft.com/office/drawing/2014/chartex">
+          <mc:Fallback xmlns:cx="http://schemas.microsoft.com/office/drawing/2014/chartex" xmlns:cx1="http://schemas.microsoft.com/office/drawing/2015/9/8/chartex" xmlns:cx2="http://schemas.microsoft.com/office/drawing/2015/10/21/chartex" xmlns:cx3="http://schemas.microsoft.com/office/drawing/2016/5/9/chartex" xmlns:cx4="http://schemas.microsoft.com/office/drawing/2016/5/10/chartex" xmlns:cx5="http://schemas.microsoft.com/office/drawing/2016/5/11/chartex" xmlns:cx6="http://schemas.microsoft.com/office/drawing/2016/5/12/chartex" xmlns:cx7="http://schemas.microsoft.com/office/drawing/2016/5/13/chartex" xmlns:cx8="http://schemas.microsoft.com/office/drawing/2016/5/14/chartex" xmlns:aink="http://schemas.microsoft.com/office/drawing/2016/ink" xmlns:am3d="http://schemas.microsoft.com/office/drawing/2017/model3d" xmlns:w16cex="http://schemas.microsoft.com/office/word/2018/wordml/cex" xmlns:w16cid="http://schemas.microsoft.com/office/word/2016/wordml/cid" xmlns:w16="http://schemas.microsoft.com/office/word/2018/wordml" xmlns:w16sdtdh="http://schemas.microsoft.com/office/word/2020/wordml/sdtdatahash" xmlns:w16se="http://schemas.microsoft.com/office/word/2015/wordml/symex">
             <w:pict>
               <v:shape w14:anchorId="057AAEFF" id="Flowchart: Alternate Process 32" o:spid="_x0000_s1038" type="#_x0000_t176" style="position:absolute;margin-left:-91.4pt;margin-top:11.05pt;width:219.5pt;height:20.7pt;rotation:-90;z-index:251703296;visibility:visible;mso-wrap-style:square;mso-width-percent:0;mso-height-percent:0;mso-wrap-distance-left:9pt;mso-wrap-distance-top:0;mso-wrap-distance-right:9pt;mso-wrap-distance-bottom:0;mso-position-horizontal:absolute;mso-position-horizontal-relative:text;mso-position-vertical:absolute;mso-position-vertical-relative:text;mso-width-percent:0;mso-height-percent:0;mso-width-relative:margin;mso-height-relative:margin;v-text-anchor:middle" o:gfxdata="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" fillcolor="#9cc2e5 [1944]" strokecolor="black [3213]" strokeweight="1pt">
                 <v:textbox>
@@ -2500,7 +2496,7 @@
               </wp:anchor>
             </w:drawing>
           </mc:Choice>
-          <mc:Fallback xmlns:w16se="http://schemas.microsoft.com/office/word/2015/wordml/symex" xmlns:w16sdtdh="http://schemas.microsoft.com/office/word/2020/wordml/sdtdatahash" xmlns:w16="http://schemas.microsoft.com/office/word/2018/wordml" xmlns:w16cid="http://schemas.microsoft.com/office/word/2016/wordml/cid" xmlns:w16cex="http://schemas.microsoft.com/office/word/2018/wordml/cex" xmlns:am3d="http://schemas.microsoft.com/office/drawing/2017/model3d" xmlns:aink="http://schemas.microsoft.com/office/drawing/2016/ink" xmlns:cx8="http://schemas.microsoft.com/office/drawing/2016/5/14/chartex" xmlns:cx7="http://schemas.microsoft.com/office/drawing/2016/5/13/chartex" xmlns:cx6="http://schemas.microsoft.com/office/drawing/2016/5/12/chartex" xmlns:cx5="http://schemas.microsoft.com/office/drawing/2016/5/11/chartex" xmlns:cx4="http://schemas.microsoft.com/office/drawing/2016/5/10/chartex" xmlns:cx3="http://schemas.microsoft.com/office/drawing/2016/5/9/chartex" xmlns:cx2="http://schemas.microsoft.com/office/drawing/2015/10/21/chartex" xmlns:cx1="http://schemas.microsoft.com/office/drawing/2015/9/8/chartex" xmlns:cx="http://schemas.microsoft.com/office/drawing/2014/chartex">
+          <mc:Fallback xmlns:cx="http://schemas.microsoft.com/office/drawing/2014/chartex" xmlns:cx1="http://schemas.microsoft.com/office/drawing/2015/9/8/chartex" xmlns:cx2="http://schemas.microsoft.com/office/drawing/2015/10/21/chartex" xmlns:cx3="http://schemas.microsoft.com/office/drawing/2016/5/9/chartex" xmlns:cx4="http://schemas.microsoft.com/office/drawing/2016/5/10/chartex" xmlns:cx5="http://schemas.microsoft.com/office/drawing/2016/5/11/chartex" xmlns:cx6="http://schemas.microsoft.com/office/drawing/2016/5/12/chartex" xmlns:cx7="http://schemas.microsoft.com/office/drawing/2016/5/13/chartex" xmlns:cx8="http://schemas.microsoft.com/office/drawing/2016/5/14/chartex" xmlns:aink="http://schemas.microsoft.com/office/drawing/2016/ink" xmlns:am3d="http://schemas.microsoft.com/office/drawing/2017/model3d" xmlns:w16cex="http://schemas.microsoft.com/office/word/2018/wordml/cex" xmlns:w16cid="http://schemas.microsoft.com/office/word/2016/wordml/cid" xmlns:w16="http://schemas.microsoft.com/office/word/2018/wordml" xmlns:w16sdtdh="http://schemas.microsoft.com/office/word/2020/wordml/sdtdatahash" xmlns:w16se="http://schemas.microsoft.com/office/word/2015/wordml/symex">
             <w:pict>
               <v:shape w14:anchorId="7A07BA0D" id="Straight Arrow Connector 22" o:spid="_x0000_s1026" type="#_x0000_t32" style="position:absolute;margin-left:487.5pt;margin-top:5.2pt;width:0;height:22.15pt;z-index:251720704;visibility:visible;mso-wrap-style:square;mso-wrap-distance-left:9pt;mso-wrap-distance-top:0;mso-wrap-distance-right:9pt;mso-wrap-distance-bottom:0;mso-position-horizontal:absolute;mso-position-horizontal-relative:text;mso-position-vertical:absolute;mso-position-vertical-relative:text" o:gfxdata="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" strokecolor="black [3213]" strokeweight=".5pt">
                 <v:stroke endarrow="block" joinstyle="miter"/>
@@ -2570,7 +2566,7 @@
               </wp:anchor>
             </w:drawing>
           </mc:Choice>
-          <mc:Fallback xmlns:w16se="http://schemas.microsoft.com/office/word/2015/wordml/symex" xmlns:w16sdtdh="http://schemas.microsoft.com/office/word/2020/wordml/sdtdatahash" xmlns:w16="http://schemas.microsoft.com/office/word/2018/wordml" xmlns:w16cid="http://schemas.microsoft.com/office/word/2016/wordml/cid" xmlns:w16cex="http://schemas.microsoft.com/office/word/2018/wordml/cex" xmlns:am3d="http://schemas.microsoft.com/office/drawing/2017/model3d" xmlns:aink="http://schemas.microsoft.com/office/drawing/2016/ink" xmlns:cx8="http://schemas.microsoft.com/office/drawing/2016/5/14/chartex" xmlns:cx7="http://schemas.microsoft.com/office/drawing/2016/5/13/chartex" xmlns:cx6="http://schemas.microsoft.com/office/drawing/2016/5/12/chartex" xmlns:cx5="http://schemas.microsoft.com/office/drawing/2016/5/11/chartex" xmlns:cx4="http://schemas.microsoft.com/office/drawing/2016/5/10/chartex" xmlns:cx3="http://schemas.microsoft.com/office/drawing/2016/5/9/chartex" xmlns:cx2="http://schemas.microsoft.com/office/drawing/2015/10/21/chartex" xmlns:cx1="http://schemas.microsoft.com/office/drawing/2015/9/8/chartex" xmlns:cx="http://schemas.microsoft.com/office/drawing/2014/chartex">
+          <mc:Fallback xmlns:cx="http://schemas.microsoft.com/office/drawing/2014/chartex" xmlns:cx1="http://schemas.microsoft.com/office/drawing/2015/9/8/chartex" xmlns:cx2="http://schemas.microsoft.com/office/drawing/2015/10/21/chartex" xmlns:cx3="http://schemas.microsoft.com/office/drawing/2016/5/9/chartex" xmlns:cx4="http://schemas.microsoft.com/office/drawing/2016/5/10/chartex" xmlns:cx5="http://schemas.microsoft.com/office/drawing/2016/5/11/chartex" xmlns:cx6="http://schemas.microsoft.com/office/drawing/2016/5/12/chartex" xmlns:cx7="http://schemas.microsoft.com/office/drawing/2016/5/13/chartex" xmlns:cx8="http://schemas.microsoft.com/office/drawing/2016/5/14/chartex" xmlns:aink="http://schemas.microsoft.com/office/drawing/2016/ink" xmlns:am3d="http://schemas.microsoft.com/office/drawing/2017/model3d" xmlns:w16cex="http://schemas.microsoft.com/office/word/2018/wordml/cex" xmlns:w16cid="http://schemas.microsoft.com/office/word/2016/wordml/cid" xmlns:w16="http://schemas.microsoft.com/office/word/2018/wordml" xmlns:w16sdtdh="http://schemas.microsoft.com/office/word/2020/wordml/sdtdatahash" xmlns:w16se="http://schemas.microsoft.com/office/word/2015/wordml/symex">
             <w:pict>
               <v:shape w14:anchorId="00798971" id="Straight Arrow Connector 36" o:spid="_x0000_s1026" type="#_x0000_t32" style="position:absolute;margin-left:111pt;margin-top:4.45pt;width:0;height:22.15pt;z-index:251710464;visibility:visible;mso-wrap-style:square;mso-wrap-distance-left:9pt;mso-wrap-distance-top:0;mso-wrap-distance-right:9pt;mso-wrap-distance-bottom:0;mso-position-horizontal:absolute;mso-position-horizontal-relative:text;mso-position-vertical:absolute;mso-position-vertical-relative:text" o:gfxdata="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" strokecolor="black [3213]" strokeweight=".5pt">
                 <v:stroke endarrow="block" joinstyle="miter"/>
@@ -2658,7 +2654,7 @@
                                 <w:sz w:val="15"/>
                                 <w:szCs w:val="15"/>
                               </w:rPr>
-                              <w:t>Reports assessed for eligibility</w:t>
+                              <w:t>Studies selected for Chapter 2 synthesis</w:t>
                             </w:r>
                             <w:r>
                               <w:br/>
@@ -2670,7 +2666,7 @@
                                 <w:sz w:val="15"/>
                                 <w:szCs w:val="15"/>
                               </w:rPr>
-                              <w:t>(n = 38)</w:t>
+                              <w:t>(n = 35)</w:t>
                             </w:r>
                           </w:p>
                         </w:txbxContent>
@@ -2693,7 +2689,7 @@
               </wp:anchor>
             </w:drawing>
           </mc:Choice>
-          <mc:Fallback xmlns:w16se="http://schemas.microsoft.com/office/word/2015/wordml/symex" xmlns:w16sdtdh="http://schemas.microsoft.com/office/word/2020/wordml/sdtdatahash" xmlns:w16="http://schemas.microsoft.com/office/word/2018/wordml" xmlns:w16cid="http://schemas.microsoft.com/office/word/2016/wordml/cid" xmlns:w16cex="http://schemas.microsoft.com/office/word/2018/wordml/cex" xmlns:am3d="http://schemas.microsoft.com/office/drawing/2017/model3d" xmlns:aink="http://schemas.microsoft.com/office/drawing/2016/ink" xmlns:cx8="http://schemas.microsoft.com/office/drawing/2016/5/14/chartex" xmlns:cx7="http://schemas.microsoft.com/office/drawing/2016/5/13/chartex" xmlns:cx6="http://schemas.microsoft.com/office/drawing/2016/5/12/chartex" xmlns:cx5="http://schemas.microsoft.com/office/drawing/2016/5/11/chartex" xmlns:cx4="http://schemas.microsoft.com/office/drawing/2016/5/10/chartex" xmlns:cx3="http://schemas.microsoft.com/office/drawing/2016/5/9/chartex" xmlns:cx2="http://schemas.microsoft.com/office/drawing/2015/10/21/chartex" xmlns:cx1="http://schemas.microsoft.com/office/drawing/2015/9/8/chartex" xmlns:cx="http://schemas.microsoft.com/office/drawing/2014/chartex">
+          <mc:Fallback xmlns:cx="http://schemas.microsoft.com/office/drawing/2014/chartex" xmlns:cx1="http://schemas.microsoft.com/office/drawing/2015/9/8/chartex" xmlns:cx2="http://schemas.microsoft.com/office/drawing/2015/10/21/chartex" xmlns:cx3="http://schemas.microsoft.com/office/drawing/2016/5/9/chartex" xmlns:cx4="http://schemas.microsoft.com/office/drawing/2016/5/10/chartex" xmlns:cx5="http://schemas.microsoft.com/office/drawing/2016/5/11/chartex" xmlns:cx6="http://schemas.microsoft.com/office/drawing/2016/5/12/chartex" xmlns:cx7="http://schemas.microsoft.com/office/drawing/2016/5/13/chartex" xmlns:cx8="http://schemas.microsoft.com/office/drawing/2016/5/14/chartex" xmlns:aink="http://schemas.microsoft.com/office/drawing/2016/ink" xmlns:am3d="http://schemas.microsoft.com/office/drawing/2017/model3d" xmlns:w16cex="http://schemas.microsoft.com/office/word/2018/wordml/cex" xmlns:w16cid="http://schemas.microsoft.com/office/word/2016/wordml/cid" xmlns:w16="http://schemas.microsoft.com/office/word/2018/wordml" xmlns:w16sdtdh="http://schemas.microsoft.com/office/word/2020/wordml/sdtdatahash" xmlns:w16se="http://schemas.microsoft.com/office/word/2015/wordml/symex">
             <w:pict>
               <v:rect w14:anchorId="1E35EB00" id="Rectangle 11" o:spid="_x0000_s1039" style="position:absolute;margin-left:414.55pt;margin-top:1.7pt;width:148.6pt;height:41.45pt;z-index:251675648;visibility:visible;mso-wrap-style:square;mso-width-percent:0;mso-height-percent:0;mso-wrap-distance-left:9pt;mso-wrap-distance-top:0;mso-wrap-distance-right:9pt;mso-wrap-distance-bottom:0;mso-position-horizontal:absolute;mso-position-horizontal-relative:text;mso-position-vertical:absolute;mso-position-vertical-relative:text;mso-width-percent:0;mso-height-percent:0;mso-width-relative:margin;mso-height-relative:margin;v-text-anchor:middle" o:gfxdata="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" filled="f" strokecolor="black [3213]" strokeweight="1pt">
                 <v:textbox>
@@ -2709,7 +2705,7 @@
                           <w:sz w:val="15"/>
                           <w:szCs w:val="15"/>
                         </w:rPr>
-                        <w:t>Reports assessed for eligibility</w:t>
+                        <w:t>Studies selected for Chapter 2 synthesis</w:t>
                       </w:r>
                       <w:r>
                         <w:br/>
@@ -2721,7 +2717,7 @@
                           <w:sz w:val="15"/>
                           <w:szCs w:val="15"/>
                         </w:rPr>
-                        <w:t>(n = 38)</w:t>
+                        <w:t>(n = 35)</w:t>
                       </w:r>
                     </w:p>
                   </w:txbxContent>
@@ -2800,7 +2796,7 @@
                                 <w:sz w:val="15"/>
                                 <w:szCs w:val="15"/>
                               </w:rPr>
-                              <w:t>Reports excluded after full-text/access assessment:</w:t>
+                              <w:t>Composition of selected studies:</w:t>
                             </w:r>
                             <w:r>
                               <w:br/>
@@ -2812,7 +2808,7 @@
                                 <w:sz w:val="15"/>
                                 <w:szCs w:val="15"/>
                               </w:rPr>
-                              <w:t>- Disease-only or weak scope (n = 2)</w:t>
+                              <w:t>Core separation (n = 18)</w:t>
                             </w:r>
                             <w:r>
                               <w:br/>
@@ -2824,19 +2820,7 @@
                                 <w:sz w:val="15"/>
                                 <w:szCs w:val="15"/>
                               </w:rPr>
-                              <w:t>- Duplicate / earlier version (n = 1)</w:t>
-                            </w:r>
-                            <w:r>
-                              <w:br/>
-                            </w:r>
-                            <w:r>
-                              <w:rPr>
-                                <w:rFonts w:ascii="Arial" w:hAnsi="Arial"/>
-                                <w:color w:val="000000"/>
-                                <w:sz w:val="15"/>
-                                <w:szCs w:val="15"/>
-                              </w:rPr>
-                              <w:t>- Other off-scope (n = 1)</w:t>
+                              <w:t>Background/supplementary (n = 17)</w:t>
                             </w:r>
                           </w:p>
                         </w:txbxContent>
@@ -2859,7 +2843,7 @@
               </wp:anchor>
             </w:drawing>
           </mc:Choice>
-          <mc:Fallback xmlns:w16se="http://schemas.microsoft.com/office/word/2015/wordml/symex" xmlns:w16sdtdh="http://schemas.microsoft.com/office/word/2020/wordml/sdtdatahash" xmlns:w16="http://schemas.microsoft.com/office/word/2018/wordml" xmlns:w16cid="http://schemas.microsoft.com/office/word/2016/wordml/cid" xmlns:w16cex="http://schemas.microsoft.com/office/word/2018/wordml/cex" xmlns:am3d="http://schemas.microsoft.com/office/drawing/2017/model3d" xmlns:aink="http://schemas.microsoft.com/office/drawing/2016/ink" xmlns:cx8="http://schemas.microsoft.com/office/drawing/2016/5/14/chartex" xmlns:cx7="http://schemas.microsoft.com/office/drawing/2016/5/13/chartex" xmlns:cx6="http://schemas.microsoft.com/office/drawing/2016/5/12/chartex" xmlns:cx5="http://schemas.microsoft.com/office/drawing/2016/5/11/chartex" xmlns:cx4="http://schemas.microsoft.com/office/drawing/2016/5/10/chartex" xmlns:cx3="http://schemas.microsoft.com/office/drawing/2016/5/9/chartex" xmlns:cx2="http://schemas.microsoft.com/office/drawing/2015/10/21/chartex" xmlns:cx1="http://schemas.microsoft.com/office/drawing/2015/9/8/chartex" xmlns:cx="http://schemas.microsoft.com/office/drawing/2014/chartex">
+          <mc:Fallback xmlns:cx="http://schemas.microsoft.com/office/drawing/2014/chartex" xmlns:cx1="http://schemas.microsoft.com/office/drawing/2015/9/8/chartex" xmlns:cx2="http://schemas.microsoft.com/office/drawing/2015/10/21/chartex" xmlns:cx3="http://schemas.microsoft.com/office/drawing/2016/5/9/chartex" xmlns:cx4="http://schemas.microsoft.com/office/drawing/2016/5/10/chartex" xmlns:cx5="http://schemas.microsoft.com/office/drawing/2016/5/11/chartex" xmlns:cx6="http://schemas.microsoft.com/office/drawing/2016/5/12/chartex" xmlns:cx7="http://schemas.microsoft.com/office/drawing/2016/5/13/chartex" xmlns:cx8="http://schemas.microsoft.com/office/drawing/2016/5/14/chartex" xmlns:aink="http://schemas.microsoft.com/office/drawing/2016/ink" xmlns:am3d="http://schemas.microsoft.com/office/drawing/2017/model3d" xmlns:w16cex="http://schemas.microsoft.com/office/word/2018/wordml/cex" xmlns:w16cid="http://schemas.microsoft.com/office/word/2016/wordml/cid" xmlns:w16="http://schemas.microsoft.com/office/word/2018/wordml" xmlns:w16sdtdh="http://schemas.microsoft.com/office/word/2020/wordml/sdtdatahash" xmlns:w16se="http://schemas.microsoft.com/office/word/2015/wordml/symex">
             <w:pict>
               <v:rect w14:anchorId="22C4B658" id="Rectangle 12" o:spid="_x0000_s1040" style="position:absolute;margin-left:610.7pt;margin-top:2.35pt;width:148.6pt;height:87pt;z-index:251676672;visibility:visible;mso-wrap-style:square;mso-width-percent:0;mso-height-percent:0;mso-wrap-distance-left:9pt;mso-wrap-distance-top:0;mso-wrap-distance-right:9pt;mso-wrap-distance-bottom:0;mso-position-horizontal:absolute;mso-position-horizontal-relative:text;mso-position-vertical:absolute;mso-position-vertical-relative:text;mso-width-percent:0;mso-height-percent:0;mso-width-relative:margin;mso-height-relative:margin;v-text-anchor:middle" o:gfxdata="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" filled="f" strokecolor="black [3213]" strokeweight="1pt">
                 <v:textbox>
@@ -2875,7 +2859,7 @@
                           <w:sz w:val="15"/>
                           <w:szCs w:val="15"/>
                         </w:rPr>
-                        <w:t>Reports excluded after full-text/access assessment:</w:t>
+                        <w:t>Composition of selected studies:</w:t>
                       </w:r>
                       <w:r>
                         <w:br/>
@@ -2887,7 +2871,7 @@
                           <w:sz w:val="15"/>
                           <w:szCs w:val="15"/>
                         </w:rPr>
-                        <w:t>- Disease-only or weak scope (n = 2)</w:t>
+                        <w:t>Core separation (n = 18)</w:t>
                       </w:r>
                       <w:r>
                         <w:br/>
@@ -2899,19 +2883,7 @@
                           <w:sz w:val="15"/>
                           <w:szCs w:val="15"/>
                         </w:rPr>
-                        <w:t>- Duplicate / earlier version (n = 1)</w:t>
-                      </w:r>
-                      <w:r>
-                        <w:br/>
-                      </w:r>
-                      <w:r>
-                        <w:rPr>
-                          <w:rFonts w:ascii="Arial" w:hAnsi="Arial"/>
-                          <w:color w:val="000000"/>
-                          <w:sz w:val="15"/>
-                          <w:szCs w:val="15"/>
-                        </w:rPr>
-                        <w:t>- Other off-scope (n = 1)</w:t>
+                        <w:t>Background/supplementary (n = 17)</w:t>
                       </w:r>
                     </w:p>
                   </w:txbxContent>
@@ -2982,7 +2954,7 @@
               </wp:anchor>
             </w:drawing>
           </mc:Choice>
-          <mc:Fallback xmlns:w16se="http://schemas.microsoft.com/office/word/2015/wordml/symex" xmlns:w16sdtdh="http://schemas.microsoft.com/office/word/2020/wordml/sdtdatahash" xmlns:w16="http://schemas.microsoft.com/office/word/2018/wordml" xmlns:w16cid="http://schemas.microsoft.com/office/word/2016/wordml/cid" xmlns:w16cex="http://schemas.microsoft.com/office/word/2018/wordml/cex" xmlns:am3d="http://schemas.microsoft.com/office/drawing/2017/model3d" xmlns:aink="http://schemas.microsoft.com/office/drawing/2016/ink" xmlns:cx8="http://schemas.microsoft.com/office/drawing/2016/5/14/chartex" xmlns:cx7="http://schemas.microsoft.com/office/drawing/2016/5/13/chartex" xmlns:cx6="http://schemas.microsoft.com/office/drawing/2016/5/12/chartex" xmlns:cx5="http://schemas.microsoft.com/office/drawing/2016/5/11/chartex" xmlns:cx4="http://schemas.microsoft.com/office/drawing/2016/5/10/chartex" xmlns:cx3="http://schemas.microsoft.com/office/drawing/2016/5/9/chartex" xmlns:cx2="http://schemas.microsoft.com/office/drawing/2015/10/21/chartex" xmlns:cx1="http://schemas.microsoft.com/office/drawing/2015/9/8/chartex" xmlns:cx="http://schemas.microsoft.com/office/drawing/2014/chartex">
+          <mc:Fallback xmlns:cx="http://schemas.microsoft.com/office/drawing/2014/chartex" xmlns:cx1="http://schemas.microsoft.com/office/drawing/2015/9/8/chartex" xmlns:cx2="http://schemas.microsoft.com/office/drawing/2015/10/21/chartex" xmlns:cx3="http://schemas.microsoft.com/office/drawing/2016/5/9/chartex" xmlns:cx4="http://schemas.microsoft.com/office/drawing/2016/5/10/chartex" xmlns:cx5="http://schemas.microsoft.com/office/drawing/2016/5/11/chartex" xmlns:cx6="http://schemas.microsoft.com/office/drawing/2016/5/12/chartex" xmlns:cx7="http://schemas.microsoft.com/office/drawing/2016/5/13/chartex" xmlns:cx8="http://schemas.microsoft.com/office/drawing/2016/5/14/chartex" xmlns:aink="http://schemas.microsoft.com/office/drawing/2016/ink" xmlns:am3d="http://schemas.microsoft.com/office/drawing/2017/model3d" xmlns:w16cex="http://schemas.microsoft.com/office/word/2018/wordml/cex" xmlns:w16cid="http://schemas.microsoft.com/office/word/2016/wordml/cid" xmlns:w16="http://schemas.microsoft.com/office/word/2018/wordml" xmlns:w16sdtdh="http://schemas.microsoft.com/office/word/2020/wordml/sdtdatahash" xmlns:w16se="http://schemas.microsoft.com/office/word/2015/wordml/symex">
             <w:pict>
               <v:shape w14:anchorId="32C5FFEE" id="Straight Arrow Connector 17" o:spid="_x0000_s1026" type="#_x0000_t32" style="position:absolute;margin-left:195pt;margin-top:23.2pt;width:44.35pt;height:0;z-index:251685888;visibility:visible;mso-wrap-style:square;mso-wrap-distance-left:9pt;mso-wrap-distance-top:0;mso-wrap-distance-right:9pt;mso-wrap-distance-bottom:0;mso-position-horizontal:absolute;mso-position-horizontal-relative:text;mso-position-vertical:absolute;mso-position-vertical-relative:text" o:gfxdata="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" strokecolor="black [3213]" strokeweight=".5pt">
                 <v:stroke endarrow="block" joinstyle="miter"/>
@@ -3060,7 +3032,7 @@
                                 <w:sz w:val="15"/>
                                 <w:szCs w:val="15"/>
                               </w:rPr>
-                              <w:t>Reports assessed for eligibility</w:t>
+                              <w:t>Studies selected for Chapter 2 synthesis</w:t>
                             </w:r>
                             <w:r>
                               <w:br/>
@@ -3072,7 +3044,7 @@
                                 <w:sz w:val="15"/>
                                 <w:szCs w:val="15"/>
                               </w:rPr>
-                              <w:t>(n = 38)</w:t>
+                              <w:t>(n = 35)</w:t>
                             </w:r>
                           </w:p>
                         </w:txbxContent>
@@ -3111,7 +3083,7 @@
                           <w:sz w:val="15"/>
                           <w:szCs w:val="15"/>
                         </w:rPr>
-                        <w:t>Reports assessed for eligibility</w:t>
+                        <w:t>Studies selected for Chapter 2 synthesis</w:t>
                       </w:r>
                       <w:r>
                         <w:br/>
@@ -3123,7 +3095,7 @@
                           <w:sz w:val="15"/>
                           <w:szCs w:val="15"/>
                         </w:rPr>
-                        <w:t>(n = 38)</w:t>
+                        <w:t>(n = 35)</w:t>
                       </w:r>
                     </w:p>
                   </w:txbxContent>
@@ -3202,7 +3174,7 @@
                                 <w:sz w:val="15"/>
                                 <w:szCs w:val="15"/>
                               </w:rPr>
-                              <w:t>Reports excluded after full-text/access assessment:</w:t>
+                              <w:t>Composition of selected studies:</w:t>
                             </w:r>
                             <w:r>
                               <w:br/>
@@ -3214,10 +3186,7 @@
                                 <w:sz w:val="15"/>
                                 <w:szCs w:val="15"/>
                               </w:rPr>
-                              <w:t>- Disease-only or weak scope (n = 2)</w:t>
-                            </w:r>
-                            <w:r>
-                              <w:br/>
+                              <w:t xml:space="preserve">Core </w:t>
                             </w:r>
                             <w:r>
                               <w:rPr>
@@ -3226,7 +3195,7 @@
                                 <w:sz w:val="15"/>
                                 <w:szCs w:val="15"/>
                               </w:rPr>
-                              <w:t>- Duplicate / earlier version (n = 1)</w:t>
+                              <w:t>separation (n = 18)</w:t>
                             </w:r>
                             <w:r>
                               <w:br/>
@@ -3238,7 +3207,7 @@
                                 <w:sz w:val="15"/>
                                 <w:szCs w:val="15"/>
                               </w:rPr>
-                              <w:t>- Other off-scope (n = 1)</w:t>
+                              <w:t>Background/supplementary (n = 17)</w:t>
                             </w:r>
                           </w:p>
                         </w:txbxContent>
@@ -3277,7 +3246,7 @@
                           <w:sz w:val="15"/>
                           <w:szCs w:val="15"/>
                         </w:rPr>
-                        <w:t>Reports excluded after full-text/access assessment:</w:t>
+                        <w:t>Composition of selected studies:</w:t>
                       </w:r>
                       <w:r>
                         <w:br/>
@@ -3289,7 +3258,7 @@
                           <w:sz w:val="15"/>
                           <w:szCs w:val="15"/>
                         </w:rPr>
-                        <w:t>- Disease-only or weak scope (n = 2)</w:t>
+                        <w:t>Core separation (n = 18)</w:t>
                       </w:r>
                       <w:r>
                         <w:br/>
@@ -3301,19 +3270,7 @@
                           <w:sz w:val="15"/>
                           <w:szCs w:val="15"/>
                         </w:rPr>
-                        <w:t>- Duplicate / earlier version (n = 1)</w:t>
-                      </w:r>
-                      <w:r>
-                        <w:br/>
-                      </w:r>
-                      <w:r>
-                        <w:rPr>
-                          <w:rFonts w:ascii="Arial" w:hAnsi="Arial"/>
-                          <w:color w:val="000000"/>
-                          <w:sz w:val="15"/>
-                          <w:szCs w:val="15"/>
-                        </w:rPr>
-                        <w:t>- Other off-scope (n = 1)</w:t>
+                        <w:t>Background/supplementary (n = 17)</w:t>
                       </w:r>
                     </w:p>
                   </w:txbxContent>
@@ -3389,7 +3346,7 @@
               </wp:anchor>
             </w:drawing>
           </mc:Choice>
-          <mc:Fallback xmlns:w16se="http://schemas.microsoft.com/office/word/2015/wordml/symex" xmlns:w16sdtdh="http://schemas.microsoft.com/office/word/2020/wordml/sdtdatahash" xmlns:w16="http://schemas.microsoft.com/office/word/2018/wordml" xmlns:w16cid="http://schemas.microsoft.com/office/word/2016/wordml/cid" xmlns:w16cex="http://schemas.microsoft.com/office/word/2018/wordml/cex" xmlns:am3d="http://schemas.microsoft.com/office/drawing/2017/model3d" xmlns:aink="http://schemas.microsoft.com/office/drawing/2016/ink" xmlns:cx8="http://schemas.microsoft.com/office/drawing/2016/5/14/chartex" xmlns:cx7="http://schemas.microsoft.com/office/drawing/2016/5/13/chartex" xmlns:cx6="http://schemas.microsoft.com/office/drawing/2016/5/12/chartex" xmlns:cx5="http://schemas.microsoft.com/office/drawing/2016/5/11/chartex" xmlns:cx4="http://schemas.microsoft.com/office/drawing/2016/5/10/chartex" xmlns:cx3="http://schemas.microsoft.com/office/drawing/2016/5/9/chartex" xmlns:cx2="http://schemas.microsoft.com/office/drawing/2015/10/21/chartex" xmlns:cx1="http://schemas.microsoft.com/office/drawing/2015/9/8/chartex" xmlns:cx="http://schemas.microsoft.com/office/drawing/2014/chartex">
+          <mc:Fallback xmlns:cx="http://schemas.microsoft.com/office/drawing/2014/chartex" xmlns:cx1="http://schemas.microsoft.com/office/drawing/2015/9/8/chartex" xmlns:cx2="http://schemas.microsoft.com/office/drawing/2015/10/21/chartex" xmlns:cx3="http://schemas.microsoft.com/office/drawing/2016/5/9/chartex" xmlns:cx4="http://schemas.microsoft.com/office/drawing/2016/5/10/chartex" xmlns:cx5="http://schemas.microsoft.com/office/drawing/2016/5/11/chartex" xmlns:cx6="http://schemas.microsoft.com/office/drawing/2016/5/12/chartex" xmlns:cx7="http://schemas.microsoft.com/office/drawing/2016/5/13/chartex" xmlns:cx8="http://schemas.microsoft.com/office/drawing/2016/5/14/chartex" xmlns:aink="http://schemas.microsoft.com/office/drawing/2016/ink" xmlns:am3d="http://schemas.microsoft.com/office/drawing/2017/model3d" xmlns:w16cex="http://schemas.microsoft.com/office/word/2018/wordml/cex" xmlns:w16cid="http://schemas.microsoft.com/office/word/2016/wordml/cid" xmlns:w16="http://schemas.microsoft.com/office/word/2018/wordml" xmlns:w16sdtdh="http://schemas.microsoft.com/office/word/2020/wordml/sdtdatahash" xmlns:w16se="http://schemas.microsoft.com/office/word/2015/wordml/symex">
             <w:pict>
               <v:shape w14:anchorId="78059548" id="Straight Arrow Connector 18" o:spid="_x0000_s1026" type="#_x0000_t32" style="position:absolute;margin-left:564.95pt;margin-top:10.1pt;width:44.35pt;height:0;z-index:251687936;visibility:visible;mso-wrap-style:square;mso-wrap-distance-left:9pt;mso-wrap-distance-top:0;mso-wrap-distance-right:9pt;mso-wrap-distance-bottom:0;mso-position-horizontal:absolute;mso-position-horizontal-relative:text;mso-position-vertical:absolute;mso-position-vertical-relative:text" o:gfxdata="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" strokecolor="black [3213]" strokeweight=".5pt">
                 <v:stroke endarrow="block" joinstyle="miter"/>
@@ -3477,7 +3434,7 @@
               </wp:anchor>
             </w:drawing>
           </mc:Choice>
-          <mc:Fallback xmlns:w16se="http://schemas.microsoft.com/office/word/2015/wordml/symex" xmlns:w16sdtdh="http://schemas.microsoft.com/office/word/2020/wordml/sdtdatahash" xmlns:w16="http://schemas.microsoft.com/office/word/2018/wordml" xmlns:w16cid="http://schemas.microsoft.com/office/word/2016/wordml/cid" xmlns:w16cex="http://schemas.microsoft.com/office/word/2018/wordml/cex" xmlns:am3d="http://schemas.microsoft.com/office/drawing/2017/model3d" xmlns:aink="http://schemas.microsoft.com/office/drawing/2016/ink" xmlns:cx8="http://schemas.microsoft.com/office/drawing/2016/5/14/chartex" xmlns:cx7="http://schemas.microsoft.com/office/drawing/2016/5/13/chartex" xmlns:cx6="http://schemas.microsoft.com/office/drawing/2016/5/12/chartex" xmlns:cx5="http://schemas.microsoft.com/office/drawing/2016/5/11/chartex" xmlns:cx4="http://schemas.microsoft.com/office/drawing/2016/5/10/chartex" xmlns:cx3="http://schemas.microsoft.com/office/drawing/2016/5/9/chartex" xmlns:cx2="http://schemas.microsoft.com/office/drawing/2015/10/21/chartex" xmlns:cx1="http://schemas.microsoft.com/office/drawing/2015/9/8/chartex" xmlns:cx="http://schemas.microsoft.com/office/drawing/2014/chartex">
+          <mc:Fallback xmlns:cx="http://schemas.microsoft.com/office/drawing/2014/chartex" xmlns:cx1="http://schemas.microsoft.com/office/drawing/2015/9/8/chartex" xmlns:cx2="http://schemas.microsoft.com/office/drawing/2015/10/21/chartex" xmlns:cx3="http://schemas.microsoft.com/office/drawing/2016/5/9/chartex" xmlns:cx4="http://schemas.microsoft.com/office/drawing/2016/5/10/chartex" xmlns:cx5="http://schemas.microsoft.com/office/drawing/2016/5/11/chartex" xmlns:cx6="http://schemas.microsoft.com/office/drawing/2016/5/12/chartex" xmlns:cx7="http://schemas.microsoft.com/office/drawing/2016/5/13/chartex" xmlns:cx8="http://schemas.microsoft.com/office/drawing/2016/5/14/chartex" xmlns:aink="http://schemas.microsoft.com/office/drawing/2016/ink" xmlns:am3d="http://schemas.microsoft.com/office/drawing/2017/model3d" xmlns:w16cex="http://schemas.microsoft.com/office/word/2018/wordml/cex" xmlns:w16cid="http://schemas.microsoft.com/office/word/2016/wordml/cid" xmlns:w16="http://schemas.microsoft.com/office/word/2018/wordml" xmlns:w16sdtdh="http://schemas.microsoft.com/office/word/2020/wordml/sdtdatahash" xmlns:w16se="http://schemas.microsoft.com/office/word/2015/wordml/symex">
             <w:pict>
               <v:shapetype w14:anchorId="7A9C69CC" id="_x0000_t34" coordsize="21600,21600" o:spt="34" o:oned="t" adj="10800" path="m,l@0,0@0,21600,21600,21600e" filled="f">
                 <v:stroke joinstyle="miter"/>
@@ -3558,7 +3515,7 @@
               </wp:anchor>
             </w:drawing>
           </mc:Choice>
-          <mc:Fallback xmlns:w16se="http://schemas.microsoft.com/office/word/2015/wordml/symex" xmlns:w16sdtdh="http://schemas.microsoft.com/office/word/2020/wordml/sdtdatahash" xmlns:w16="http://schemas.microsoft.com/office/word/2018/wordml" xmlns:w16cid="http://schemas.microsoft.com/office/word/2016/wordml/cid" xmlns:w16cex="http://schemas.microsoft.com/office/word/2018/wordml/cex" xmlns:am3d="http://schemas.microsoft.com/office/drawing/2017/model3d" xmlns:aink="http://schemas.microsoft.com/office/drawing/2016/ink" xmlns:cx8="http://schemas.microsoft.com/office/drawing/2016/5/14/chartex" xmlns:cx7="http://schemas.microsoft.com/office/drawing/2016/5/13/chartex" xmlns:cx6="http://schemas.microsoft.com/office/drawing/2016/5/12/chartex" xmlns:cx5="http://schemas.microsoft.com/office/drawing/2016/5/11/chartex" xmlns:cx4="http://schemas.microsoft.com/office/drawing/2016/5/10/chartex" xmlns:cx3="http://schemas.microsoft.com/office/drawing/2016/5/9/chartex" xmlns:cx2="http://schemas.microsoft.com/office/drawing/2015/10/21/chartex" xmlns:cx1="http://schemas.microsoft.com/office/drawing/2015/9/8/chartex" xmlns:cx="http://schemas.microsoft.com/office/drawing/2014/chartex">
+          <mc:Fallback xmlns:cx="http://schemas.microsoft.com/office/drawing/2014/chartex" xmlns:cx1="http://schemas.microsoft.com/office/drawing/2015/9/8/chartex" xmlns:cx2="http://schemas.microsoft.com/office/drawing/2015/10/21/chartex" xmlns:cx3="http://schemas.microsoft.com/office/drawing/2016/5/9/chartex" xmlns:cx4="http://schemas.microsoft.com/office/drawing/2016/5/10/chartex" xmlns:cx5="http://schemas.microsoft.com/office/drawing/2016/5/11/chartex" xmlns:cx6="http://schemas.microsoft.com/office/drawing/2016/5/12/chartex" xmlns:cx7="http://schemas.microsoft.com/office/drawing/2016/5/13/chartex" xmlns:cx8="http://schemas.microsoft.com/office/drawing/2016/5/14/chartex" xmlns:aink="http://schemas.microsoft.com/office/drawing/2016/ink" xmlns:am3d="http://schemas.microsoft.com/office/drawing/2017/model3d" xmlns:w16cex="http://schemas.microsoft.com/office/word/2018/wordml/cex" xmlns:w16cid="http://schemas.microsoft.com/office/word/2016/wordml/cid" xmlns:w16="http://schemas.microsoft.com/office/word/2018/wordml" xmlns:w16sdtdh="http://schemas.microsoft.com/office/word/2020/wordml/sdtdatahash" xmlns:w16se="http://schemas.microsoft.com/office/word/2015/wordml/symex">
             <w:pict>
               <v:shape w14:anchorId="56BA196F" id="Straight Arrow Connector 19" o:spid="_x0000_s1026" type="#_x0000_t32" style="position:absolute;margin-left:110.3pt;margin-top:2.35pt;width:0;height:58.75pt;z-index:251714560;visibility:visible;mso-wrap-style:square;mso-wrap-distance-left:9pt;mso-wrap-distance-top:0;mso-wrap-distance-right:9pt;mso-wrap-distance-bottom:0;mso-position-horizontal:absolute;mso-position-horizontal-relative:text;mso-position-vertical:absolute;mso-position-vertical-relative:text" o:gfxdata="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" strokecolor="black [3213]" strokeweight=".5pt">
                 <v:stroke endarrow="block" joinstyle="miter"/>
@@ -3656,7 +3613,7 @@
                                 <w:sz w:val="15"/>
                                 <w:szCs w:val="15"/>
                               </w:rPr>
-                              <w:t>Studies included in literature review</w:t>
+                              <w:t>Studies selected for Chapter 2 synthesis</w:t>
                             </w:r>
                             <w:r>
                               <w:br/>
@@ -3668,31 +3625,7 @@
                                 <w:sz w:val="15"/>
                                 <w:szCs w:val="15"/>
                               </w:rPr>
-                              <w:t>(n = 18)</w:t>
-                            </w:r>
-                            <w:r>
-                              <w:br/>
-                            </w:r>
-                            <w:r>
-                              <w:rPr>
-                                <w:rFonts w:ascii="Arial" w:hAnsi="Arial"/>
-                                <w:color w:val="000000"/>
-                                <w:sz w:val="15"/>
-                                <w:szCs w:val="15"/>
-                              </w:rPr>
-                              <w:t>Background/supplementary studies retained</w:t>
-                            </w:r>
-                            <w:r>
-                              <w:br/>
-                            </w:r>
-                            <w:r>
-                              <w:rPr>
-                                <w:rFonts w:ascii="Arial" w:hAnsi="Arial"/>
-                                <w:color w:val="000000"/>
-                                <w:sz w:val="15"/>
-                                <w:szCs w:val="15"/>
-                              </w:rPr>
-                              <w:t>(n = 31)</w:t>
+                              <w:t>(n = 35)</w:t>
                             </w:r>
                           </w:p>
                         </w:txbxContent>
@@ -3731,7 +3664,7 @@
                           <w:sz w:val="15"/>
                           <w:szCs w:val="15"/>
                         </w:rPr>
-                        <w:t>Studies included in literature review</w:t>
+                        <w:t>Studies selected for Chapter 2 synthesis</w:t>
                       </w:r>
                       <w:r>
                         <w:br/>
@@ -3743,31 +3676,7 @@
                           <w:sz w:val="15"/>
                           <w:szCs w:val="15"/>
                         </w:rPr>
-                        <w:t>(n = 18)</w:t>
-                      </w:r>
-                      <w:r>
-                        <w:br/>
-                      </w:r>
-                      <w:r>
-                        <w:rPr>
-                          <w:rFonts w:ascii="Arial" w:hAnsi="Arial"/>
-                          <w:color w:val="000000"/>
-                          <w:sz w:val="15"/>
-                          <w:szCs w:val="15"/>
-                        </w:rPr>
-                        <w:t>Background/supplementary studies retained</w:t>
-                      </w:r>
-                      <w:r>
-                        <w:br/>
-                      </w:r>
-                      <w:r>
-                        <w:rPr>
-                          <w:rFonts w:ascii="Arial" w:hAnsi="Arial"/>
-                          <w:color w:val="000000"/>
-                          <w:sz w:val="15"/>
-                          <w:szCs w:val="15"/>
-                        </w:rPr>
-                        <w:t>(n = 31)</w:t>
+                        <w:t>(n = 35)</w:t>
                       </w:r>
                     </w:p>
                   </w:txbxContent>
@@ -3880,7 +3789,7 @@
               </wp:anchor>
             </w:drawing>
           </mc:Choice>
-          <mc:Fallback xmlns:w16se="http://schemas.microsoft.com/office/word/2015/wordml/symex" xmlns:w16sdtdh="http://schemas.microsoft.com/office/word/2020/wordml/sdtdatahash" xmlns:w16="http://schemas.microsoft.com/office/word/2018/wordml" xmlns:w16cid="http://schemas.microsoft.com/office/word/2016/wordml/cid" xmlns:w16cex="http://schemas.microsoft.com/office/word/2018/wordml/cex" xmlns:am3d="http://schemas.microsoft.com/office/drawing/2017/model3d" xmlns:aink="http://schemas.microsoft.com/office/drawing/2016/ink" xmlns:cx8="http://schemas.microsoft.com/office/drawing/2016/5/14/chartex" xmlns:cx7="http://schemas.microsoft.com/office/drawing/2016/5/13/chartex" xmlns:cx6="http://schemas.microsoft.com/office/drawing/2016/5/12/chartex" xmlns:cx5="http://schemas.microsoft.com/office/drawing/2016/5/11/chartex" xmlns:cx4="http://schemas.microsoft.com/office/drawing/2016/5/10/chartex" xmlns:cx3="http://schemas.microsoft.com/office/drawing/2016/5/9/chartex" xmlns:cx2="http://schemas.microsoft.com/office/drawing/2015/10/21/chartex" xmlns:cx1="http://schemas.microsoft.com/office/drawing/2015/9/8/chartex" xmlns:cx="http://schemas.microsoft.com/office/drawing/2014/chartex">
+          <mc:Fallback xmlns:cx="http://schemas.microsoft.com/office/drawing/2014/chartex" xmlns:cx1="http://schemas.microsoft.com/office/drawing/2015/9/8/chartex" xmlns:cx2="http://schemas.microsoft.com/office/drawing/2015/10/21/chartex" xmlns:cx3="http://schemas.microsoft.com/office/drawing/2016/5/9/chartex" xmlns:cx4="http://schemas.microsoft.com/office/drawing/2016/5/10/chartex" xmlns:cx5="http://schemas.microsoft.com/office/drawing/2016/5/11/chartex" xmlns:cx6="http://schemas.microsoft.com/office/drawing/2016/5/12/chartex" xmlns:cx7="http://schemas.microsoft.com/office/drawing/2016/5/13/chartex" xmlns:cx8="http://schemas.microsoft.com/office/drawing/2016/5/14/chartex" xmlns:aink="http://schemas.microsoft.com/office/drawing/2016/ink" xmlns:am3d="http://schemas.microsoft.com/office/drawing/2017/model3d" xmlns:w16cex="http://schemas.microsoft.com/office/word/2018/wordml/cex" xmlns:w16cid="http://schemas.microsoft.com/office/word/2016/wordml/cid" xmlns:w16="http://schemas.microsoft.com/office/word/2018/wordml" xmlns:w16sdtdh="http://schemas.microsoft.com/office/word/2020/wordml/sdtdatahash" xmlns:w16se="http://schemas.microsoft.com/office/word/2015/wordml/symex">
             <w:pict>
               <v:shape w14:anchorId="291789E9" id="Flowchart: Alternate Process 33" o:spid="_x0000_s1044" type="#_x0000_t176" style="position:absolute;margin-left:-10.5pt;margin-top:13.45pt;width:60.2pt;height:20.7pt;rotation:-90;z-index:251705344;visibility:visible;mso-wrap-style:square;mso-width-percent:0;mso-height-percent:0;mso-wrap-distance-left:9pt;mso-wrap-distance-top:0;mso-wrap-distance-right:9pt;mso-wrap-distance-bottom:0;mso-position-horizontal:absolute;mso-position-horizontal-relative:text;mso-position-vertical:absolute;mso-position-vertical-relative:text;mso-width-percent:0;mso-height-percent:0;mso-width-relative:margin;mso-height-relative:margin;v-text-anchor:middle" o:gfxdata="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" fillcolor="#9cc2e5 [1944]" strokecolor="black [3213]" strokeweight="1pt">
                 <v:textbox>
@@ -3922,8 +3831,6 @@
       <w:pPr>
         <w:spacing w:after="0" w:line="240" w:lineRule="auto"/>
       </w:pPr>
-      <w:bookmarkStart w:id="0" w:name="_GoBack"/>
-      <w:bookmarkEnd w:id="0"/>
     </w:p>
     <w:p>
       <w:pPr>
@@ -3938,80 +3845,7 @@
         </w:rPr>
       </w:pPr>
     </w:p>
-    <w:p>
-      <w:pPr>
-        <w:pStyle w:val="CM1"/>
-        <w:spacing w:before="120"/>
-        <w:rPr>
-          <w:rFonts w:ascii="Arial" w:hAnsi="Arial" w:cs="Arial"/>
-          <w:sz w:val="18"/>
-          <w:szCs w:val="18"/>
-        </w:rPr>
-      </w:pPr>
-      <w:r>
-        <w:rPr>
-          <w:rFonts w:ascii="Arial" w:hAnsi="Arial" w:cs="Arial"/>
-          <w:i/>
-          <w:iCs/>
-          <w:sz w:val="18"/>
-          <w:szCs w:val="18"/>
-        </w:rPr>
-        <w:t xml:space="preserve">From: </w:t>
-      </w:r>
-      <w:r>
-        <w:rPr>
-          <w:rFonts w:ascii="Arial" w:hAnsi="Arial" w:cs="Arial"/>
-          <w:sz w:val="18"/>
-          <w:szCs w:val="18"/>
-        </w:rPr>
-        <w:t xml:space="preserve"> Page MJ, McKenzie JE, Bossuyt PM, Boutron I, Hoffmann TC, Mulrow CD, et al. The PRISMA 2020 statement: an updated guideline for reporting systematic reviews. BMJ 2021;372:n71. doi: 10.1136/bmj.n71</w:t>
-      </w:r>
-      <w:r>
-        <w:rPr>
-          <w:rFonts w:ascii="Arial" w:hAnsi="Arial" w:cs="Arial"/>
-          <w:sz w:val="18"/>
-          <w:szCs w:val="18"/>
-        </w:rPr>
-        <w:t xml:space="preserve">. </w:t>
-      </w:r>
-      <w:r>
-        <w:rPr>
-          <w:rFonts w:ascii="Arial" w:hAnsi="Arial" w:cs="Arial"/>
-          <w:color w:val="333399"/>
-          <w:sz w:val="18"/>
-          <w:szCs w:val="18"/>
-        </w:rPr>
-        <w:t>For more information, visit:</w:t>
-      </w:r>
-      <w:r>
-        <w:rPr>
-          <w:rFonts w:ascii="Arial" w:hAnsi="Arial" w:cs="Arial"/>
-          <w:sz w:val="18"/>
-          <w:szCs w:val="18"/>
-          <w:lang w:val="da-DK"/>
-        </w:rPr>
-        <w:t xml:space="preserve"> </w:t>
-      </w:r>
-      <w:hyperlink r:id="rId8" w:history="1">
-        <w:r>
-          <w:rPr>
-            <w:rStyle w:val="Hyperlink"/>
-            <w:rFonts w:ascii="Arial" w:hAnsi="Arial" w:cs="Arial"/>
-            <w:sz w:val="18"/>
-            <w:szCs w:val="18"/>
-            <w:lang w:val="da-DK"/>
-          </w:rPr>
-          <w:t>http://www.prisma-statement.org/</w:t>
-        </w:r>
-      </w:hyperlink>
-    </w:p>
     <w:sectPr>
-      <w:headerReference w:type="even" r:id="rId9"/>
-      <w:headerReference w:type="default" r:id="rId10"/>
-      <w:footerReference w:type="even" r:id="rId11"/>
-      <w:footerReference w:type="default" r:id="rId12"/>
-      <w:headerReference w:type="first" r:id="rId13"/>
-      <w:footerReference w:type="first" r:id="rId14"/>
       <w:pgSz w:w="16838" w:h="11906" w:orient="landscape"/>
       <w:pgMar w:top="720" w:right="720" w:bottom="720" w:left="720" w:header="708" w:footer="708" w:gutter="0"/>
       <w:cols w:space="708"/>
@@ -4046,36 +3880,6 @@
 </w:endnotes>
 </file>
 
-<file path=word/footer1.xml><?xml version="1.0" encoding="utf-8"?>
-<w:ftr xmlns:wpc="http://schemas.microsoft.com/office/word/2010/wordprocessingCanvas" xmlns:mc="http://schemas.openxmlformats.org/markup-compatibility/2006" xmlns:o="urn:schemas-microsoft-com:office:office" xmlns:r="http://schemas.openxmlformats.org/officeDocument/2006/relationships" xmlns:m="http://schemas.openxmlformats.org/officeDocument/2006/math" xmlns:v="urn:schemas-microsoft-com:vml" xmlns:wp14="http://schemas.microsoft.com/office/word/2010/wordprocessingDrawing" xmlns:wp="http://schemas.openxmlformats.org/drawingml/2006/wordprocessingDrawing" xmlns:w10="urn:schemas-microsoft-com:office:word" xmlns:w="http://schemas.openxmlformats.org/wordprocessingml/2006/main" xmlns:w14="http://schemas.microsoft.com/office/word/2010/wordml" xmlns:w15="http://schemas.microsoft.com/office/word/2012/wordml" xmlns:wpg="http://schemas.microsoft.com/office/word/2010/wordprocessingGroup" xmlns:wpi="http://schemas.microsoft.com/office/word/2010/wordprocessingInk" xmlns:wne="http://schemas.microsoft.com/office/word/2006/wordml" xmlns:wps="http://schemas.microsoft.com/office/word/2010/wordprocessingShape" mc:Ignorable="w14 w15 wp14">
-  <w:p>
-    <w:pPr>
-      <w:pStyle w:val="Footer"/>
-    </w:pPr>
-  </w:p>
-</w:ftr>
-</file>
-
-<file path=word/footer2.xml><?xml version="1.0" encoding="utf-8"?>
-<w:ftr xmlns:wpc="http://schemas.microsoft.com/office/word/2010/wordprocessingCanvas" xmlns:mc="http://schemas.openxmlformats.org/markup-compatibility/2006" xmlns:o="urn:schemas-microsoft-com:office:office" xmlns:r="http://schemas.openxmlformats.org/officeDocument/2006/relationships" xmlns:m="http://schemas.openxmlformats.org/officeDocument/2006/math" xmlns:v="urn:schemas-microsoft-com:vml" xmlns:wp14="http://schemas.microsoft.com/office/word/2010/wordprocessingDrawing" xmlns:wp="http://schemas.openxmlformats.org/drawingml/2006/wordprocessingDrawing" xmlns:w10="urn:schemas-microsoft-com:office:word" xmlns:w="http://schemas.openxmlformats.org/wordprocessingml/2006/main" xmlns:w14="http://schemas.microsoft.com/office/word/2010/wordml" xmlns:w15="http://schemas.microsoft.com/office/word/2012/wordml" xmlns:wpg="http://schemas.microsoft.com/office/word/2010/wordprocessingGroup" xmlns:wpi="http://schemas.microsoft.com/office/word/2010/wordprocessingInk" xmlns:wne="http://schemas.microsoft.com/office/word/2006/wordml" xmlns:wps="http://schemas.microsoft.com/office/word/2010/wordprocessingShape" mc:Ignorable="w14 w15 wp14">
-  <w:p>
-    <w:pPr>
-      <w:pStyle w:val="Footer"/>
-    </w:pPr>
-  </w:p>
-</w:ftr>
-</file>
-
-<file path=word/footer3.xml><?xml version="1.0" encoding="utf-8"?>
-<w:ftr xmlns:wpc="http://schemas.microsoft.com/office/word/2010/wordprocessingCanvas" xmlns:mc="http://schemas.openxmlformats.org/markup-compatibility/2006" xmlns:o="urn:schemas-microsoft-com:office:office" xmlns:r="http://schemas.openxmlformats.org/officeDocument/2006/relationships" xmlns:m="http://schemas.openxmlformats.org/officeDocument/2006/math" xmlns:v="urn:schemas-microsoft-com:vml" xmlns:wp14="http://schemas.microsoft.com/office/word/2010/wordprocessingDrawing" xmlns:wp="http://schemas.openxmlformats.org/drawingml/2006/wordprocessingDrawing" xmlns:w10="urn:schemas-microsoft-com:office:word" xmlns:w="http://schemas.openxmlformats.org/wordprocessingml/2006/main" xmlns:w14="http://schemas.microsoft.com/office/word/2010/wordml" xmlns:w15="http://schemas.microsoft.com/office/word/2012/wordml" xmlns:wpg="http://schemas.microsoft.com/office/word/2010/wordprocessingGroup" xmlns:wpi="http://schemas.microsoft.com/office/word/2010/wordprocessingInk" xmlns:wne="http://schemas.microsoft.com/office/word/2006/wordml" xmlns:wps="http://schemas.microsoft.com/office/word/2010/wordprocessingShape" mc:Ignorable="w14 w15 wp14">
-  <w:p>
-    <w:pPr>
-      <w:pStyle w:val="Footer"/>
-    </w:pPr>
-  </w:p>
-</w:ftr>
-</file>
-
 <file path=word/footnotes.xml><?xml version="1.0" encoding="utf-8"?>
 <w:footnotes xmlns:wpc="http://schemas.microsoft.com/office/word/2010/wordprocessingCanvas" xmlns:mc="http://schemas.openxmlformats.org/markup-compatibility/2006" xmlns:o="urn:schemas-microsoft-com:office:office" xmlns:r="http://schemas.openxmlformats.org/officeDocument/2006/relationships" xmlns:m="http://schemas.openxmlformats.org/officeDocument/2006/math" xmlns:v="urn:schemas-microsoft-com:vml" xmlns:wp14="http://schemas.microsoft.com/office/word/2010/wordprocessingDrawing" xmlns:wp="http://schemas.openxmlformats.org/drawingml/2006/wordprocessingDrawing" xmlns:w10="urn:schemas-microsoft-com:office:word" xmlns:w="http://schemas.openxmlformats.org/wordprocessingml/2006/main" xmlns:w14="http://schemas.microsoft.com/office/word/2010/wordml" xmlns:w15="http://schemas.microsoft.com/office/word/2012/wordml" xmlns:wpg="http://schemas.microsoft.com/office/word/2010/wordprocessingGroup" xmlns:wpi="http://schemas.microsoft.com/office/word/2010/wordprocessingInk" xmlns:wne="http://schemas.microsoft.com/office/word/2006/wordml" xmlns:wps="http://schemas.microsoft.com/office/word/2010/wordprocessingShape" mc:Ignorable="w14 w15 wp14">
   <w:footnote w:type="separator" w:id="-1">
@@ -4099,51 +3903,6 @@
     </w:p>
   </w:footnote>
 </w:footnotes>
-</file>
-
-<file path=word/header1.xml><?xml version="1.0" encoding="utf-8"?>
-<w:hdr xmlns:wpc="http://schemas.microsoft.com/office/word/2010/wordprocessingCanvas" xmlns:mc="http://schemas.openxmlformats.org/markup-compatibility/2006" xmlns:o="urn:schemas-microsoft-com:office:office" xmlns:r="http://schemas.openxmlformats.org/officeDocument/2006/relationships" xmlns:m="http://schemas.openxmlformats.org/officeDocument/2006/math" xmlns:v="urn:schemas-microsoft-com:vml" xmlns:wp14="http://schemas.microsoft.com/office/word/2010/wordprocessingDrawing" xmlns:wp="http://schemas.openxmlformats.org/drawingml/2006/wordprocessingDrawing" xmlns:w10="urn:schemas-microsoft-com:office:word" xmlns:w="http://schemas.openxmlformats.org/wordprocessingml/2006/main" xmlns:w14="http://schemas.microsoft.com/office/word/2010/wordml" xmlns:w15="http://schemas.microsoft.com/office/word/2012/wordml" xmlns:wpg="http://schemas.microsoft.com/office/word/2010/wordprocessingGroup" xmlns:wpi="http://schemas.microsoft.com/office/word/2010/wordprocessingInk" xmlns:wne="http://schemas.microsoft.com/office/word/2006/wordml" xmlns:wps="http://schemas.microsoft.com/office/word/2010/wordprocessingShape" mc:Ignorable="w14 w15 wp14">
-  <w:p>
-    <w:pPr>
-      <w:pStyle w:val="Header"/>
-    </w:pPr>
-  </w:p>
-</w:hdr>
-</file>
-
-<file path=word/header2.xml><?xml version="1.0" encoding="utf-8"?>
-<w:hdr xmlns:wpc="http://schemas.microsoft.com/office/word/2010/wordprocessingCanvas" xmlns:mc="http://schemas.openxmlformats.org/markup-compatibility/2006" xmlns:o="urn:schemas-microsoft-com:office:office" xmlns:r="http://schemas.openxmlformats.org/officeDocument/2006/relationships" xmlns:m="http://schemas.openxmlformats.org/officeDocument/2006/math" xmlns:v="urn:schemas-microsoft-com:vml" xmlns:wp14="http://schemas.microsoft.com/office/word/2010/wordprocessingDrawing" xmlns:wp="http://schemas.openxmlformats.org/drawingml/2006/wordprocessingDrawing" xmlns:w10="urn:schemas-microsoft-com:office:word" xmlns:w="http://schemas.openxmlformats.org/wordprocessingml/2006/main" xmlns:w14="http://schemas.microsoft.com/office/word/2010/wordml" xmlns:w15="http://schemas.microsoft.com/office/word/2012/wordml" xmlns:wpg="http://schemas.microsoft.com/office/word/2010/wordprocessingGroup" xmlns:wpi="http://schemas.microsoft.com/office/word/2010/wordprocessingInk" xmlns:wne="http://schemas.microsoft.com/office/word/2006/wordml" xmlns:wps="http://schemas.microsoft.com/office/word/2010/wordprocessingShape" mc:Ignorable="w14 w15 wp14">
-  <w:p>
-    <w:pPr>
-      <w:spacing w:after="0" w:line="240" w:lineRule="auto"/>
-      <w:rPr>
-        <w:b/>
-      </w:rPr>
-    </w:pPr>
-    <w:r>
-      <w:rPr>
-        <w:b/>
-      </w:rPr>
-      <w:t>PRISMA 2020 flow diagram</w:t>
-    </w:r>
-    <w:r>
-      <w:rPr>
-        <w:b/>
-      </w:rPr>
-      <w:t xml:space="preserve"> for new systematic reviews which included searches of databases, registers and other sources</w:t>
-    </w:r>
-  </w:p>
-</w:hdr>
-</file>
-
-<file path=word/header3.xml><?xml version="1.0" encoding="utf-8"?>
-<w:hdr xmlns:wpc="http://schemas.microsoft.com/office/word/2010/wordprocessingCanvas" xmlns:mc="http://schemas.openxmlformats.org/markup-compatibility/2006" xmlns:o="urn:schemas-microsoft-com:office:office" xmlns:r="http://schemas.openxmlformats.org/officeDocument/2006/relationships" xmlns:m="http://schemas.openxmlformats.org/officeDocument/2006/math" xmlns:v="urn:schemas-microsoft-com:vml" xmlns:wp14="http://schemas.microsoft.com/office/word/2010/wordprocessingDrawing" xmlns:wp="http://schemas.openxmlformats.org/drawingml/2006/wordprocessingDrawing" xmlns:w10="urn:schemas-microsoft-com:office:word" xmlns:w="http://schemas.openxmlformats.org/wordprocessingml/2006/main" xmlns:w14="http://schemas.microsoft.com/office/word/2010/wordml" xmlns:w15="http://schemas.microsoft.com/office/word/2012/wordml" xmlns:wpg="http://schemas.microsoft.com/office/word/2010/wordprocessingGroup" xmlns:wpi="http://schemas.microsoft.com/office/word/2010/wordprocessingInk" xmlns:wne="http://schemas.microsoft.com/office/word/2006/wordml" xmlns:wps="http://schemas.microsoft.com/office/word/2010/wordprocessingShape" mc:Ignorable="w14 w15 wp14">
-  <w:p>
-    <w:pPr>
-      <w:pStyle w:val="Header"/>
-    </w:pPr>
-  </w:p>
-</w:hdr>
 </file>
 
 <file path=word/numbering.xml><?xml version="1.0" encoding="utf-8"?>
@@ -4640,6 +4399,7 @@
   <w:style w:type="character" w:default="1" w:styleId="DefaultParagraphFont">
     <w:name w:val="Default Paragraph Font"/>
     <w:uiPriority w:val="1"/>
+    <w:semiHidden/>
     <w:unhideWhenUsed/>
   </w:style>
   <w:style w:type="table" w:default="1" w:styleId="TableNormal">
@@ -5130,7 +4890,7 @@
 </file>
 
 <file path=customXml/itemProps1.xml><?xml version="1.0" encoding="utf-8"?>
-<ds:datastoreItem xmlns:ds="http://schemas.openxmlformats.org/officeDocument/2006/customXml" ds:itemID="{5AAFDFE1-446B-4A6D-A236-C8674B803CBE}">
+<ds:datastoreItem xmlns:ds="http://schemas.openxmlformats.org/officeDocument/2006/customXml" ds:itemID="{DC33BF51-F1E3-441E-B357-F0E2F8B26267}">
   <ds:schemaRefs>
     <ds:schemaRef ds:uri="http://schemas.openxmlformats.org/officeDocument/2006/bibliography"/>
   </ds:schemaRefs>

</xml_diff>

<commit_message>
Draft Final Report Until now (still need to fix and add stuff) :)
</commit_message>
<xml_diff>
--- a/literature-review/prisma/prisma_flow_diagram_filled.docx
+++ b/literature-review/prisma/prisma_flow_diagram_filled.docx
@@ -1126,166 +1126,6 @@
         <mc:AlternateContent>
           <mc:Choice Requires="wps">
             <w:drawing>
-              <wp:anchor distT="0" distB="0" distL="114300" distR="114300" simplePos="0" relativeHeight="251665408" behindDoc="0" locked="0" layoutInCell="1" allowOverlap="1" wp14:anchorId="4FF0996A" wp14:editId="5C3A5F6F">
-                <wp:simplePos x="0" y="0"/>
-                <wp:positionH relativeFrom="column">
-                  <wp:posOffset>3048000</wp:posOffset>
-                </wp:positionH>
-                <wp:positionV relativeFrom="paragraph">
-                  <wp:posOffset>75565</wp:posOffset>
-                </wp:positionV>
-                <wp:extent cx="1887220" cy="622300"/>
-                <wp:effectExtent l="0" t="0" r="17780" b="25400"/>
-                <wp:wrapNone/>
-                <wp:docPr id="4" name="Rectangle 4"/>
-                <wp:cNvGraphicFramePr/>
-                <a:graphic xmlns:a="http://schemas.openxmlformats.org/drawingml/2006/main">
-                  <a:graphicData uri="http://schemas.microsoft.com/office/word/2010/wordprocessingShape">
-                    <wps:wsp>
-                      <wps:cNvSpPr/>
-                      <wps:spPr>
-                        <a:xfrm>
-                          <a:off x="0" y="0"/>
-                          <a:ext cx="1887220" cy="622300"/>
-                        </a:xfrm>
-                        <a:prstGeom prst="rect">
-                          <a:avLst/>
-                        </a:prstGeom>
-                        <a:noFill/>
-                        <a:ln>
-                          <a:solidFill>
-                            <a:schemeClr val="tx1"/>
-                          </a:solidFill>
-                        </a:ln>
-                      </wps:spPr>
-                      <wps:style>
-                        <a:lnRef idx="2">
-                          <a:schemeClr val="accent1">
-                            <a:shade val="50000"/>
-                          </a:schemeClr>
-                        </a:lnRef>
-                        <a:fillRef idx="1">
-                          <a:schemeClr val="accent1"/>
-                        </a:fillRef>
-                        <a:effectRef idx="0">
-                          <a:schemeClr val="accent1"/>
-                        </a:effectRef>
-                        <a:fontRef idx="minor">
-                          <a:schemeClr val="lt1"/>
-                        </a:fontRef>
-                      </wps:style>
-                      <wps:txbx>
-                        <w:txbxContent>
-                          <w:p>
-                            <w:pPr>
-                              <w:jc w:val="center"/>
-                            </w:pPr>
-                            <w:r>
-                              <w:rPr>
-                                <w:rFonts w:ascii="Arial" w:hAnsi="Arial"/>
-                                <w:color w:val="000000"/>
-                                <w:sz w:val="15"/>
-                                <w:szCs w:val="15"/>
-                              </w:rPr>
-                              <w:t xml:space="preserve">Records excluded after screening, duplicate, scope, year-range, or access </w:t>
-                            </w:r>
-                            <w:r>
-                              <w:rPr>
-                                <w:rFonts w:ascii="Arial" w:hAnsi="Arial"/>
-                                <w:color w:val="000000"/>
-                                <w:sz w:val="15"/>
-                                <w:szCs w:val="15"/>
-                              </w:rPr>
-                              <w:t>checks</w:t>
-                            </w:r>
-                            <w:r>
-                              <w:br/>
-                            </w:r>
-                            <w:r>
-                              <w:rPr>
-                                <w:rFonts w:ascii="Arial" w:hAnsi="Arial"/>
-                                <w:color w:val="000000"/>
-                                <w:sz w:val="15"/>
-                                <w:szCs w:val="15"/>
-                              </w:rPr>
-                              <w:t>(n = 47)</w:t>
-                            </w:r>
-                          </w:p>
-                        </w:txbxContent>
-                      </wps:txbx>
-                      <wps:bodyPr rot="0" spcFirstLastPara="0" vertOverflow="overflow" horzOverflow="overflow" vert="horz" wrap="square" lIns="91440" tIns="45720" rIns="91440" bIns="45720" numCol="1" spcCol="0" rtlCol="0" fromWordArt="0" anchor="ctr" anchorCtr="0" forceAA="0" compatLnSpc="1">
-                        <a:prstTxWarp prst="textNoShape">
-                          <a:avLst/>
-                        </a:prstTxWarp>
-                        <a:noAutofit/>
-                      </wps:bodyPr>
-                    </wps:wsp>
-                  </a:graphicData>
-                </a:graphic>
-                <wp14:sizeRelH relativeFrom="margin">
-                  <wp14:pctWidth>0</wp14:pctWidth>
-                </wp14:sizeRelH>
-                <wp14:sizeRelV relativeFrom="margin">
-                  <wp14:pctHeight>0</wp14:pctHeight>
-                </wp14:sizeRelV>
-              </wp:anchor>
-            </w:drawing>
-          </mc:Choice>
-          <mc:Fallback>
-            <w:pict>
-              <v:rect w14:anchorId="4FF0996A" id="Rectangle 4" o:spid="_x0000_s1032" style="position:absolute;margin-left:240pt;margin-top:5.95pt;width:148.6pt;height:49pt;z-index:251665408;visibility:visible;mso-wrap-style:square;mso-width-percent:0;mso-height-percent:0;mso-wrap-distance-left:9pt;mso-wrap-distance-top:0;mso-wrap-distance-right:9pt;mso-wrap-distance-bottom:0;mso-position-horizontal:absolute;mso-position-horizontal-relative:text;mso-position-vertical:absolute;mso-position-vertical-relative:text;mso-width-percent:0;mso-height-percent:0;mso-width-relative:margin;mso-height-relative:margin;v-text-anchor:middle" o:gfxdata="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" filled="f" strokecolor="black [3213]" strokeweight="1pt">
-                <v:textbox>
-                  <w:txbxContent>
-                    <w:p>
-                      <w:pPr>
-                        <w:jc w:val="center"/>
-                      </w:pPr>
-                      <w:r>
-                        <w:rPr>
-                          <w:rFonts w:ascii="Arial" w:hAnsi="Arial"/>
-                          <w:color w:val="000000"/>
-                          <w:sz w:val="15"/>
-                          <w:szCs w:val="15"/>
-                        </w:rPr>
-                        <w:t xml:space="preserve">Records excluded after screening, duplicate, scope, year-range, or access </w:t>
-                      </w:r>
-                      <w:r>
-                        <w:rPr>
-                          <w:rFonts w:ascii="Arial" w:hAnsi="Arial"/>
-                          <w:color w:val="000000"/>
-                          <w:sz w:val="15"/>
-                          <w:szCs w:val="15"/>
-                        </w:rPr>
-                        <w:t>checks</w:t>
-                      </w:r>
-                      <w:r>
-                        <w:br/>
-                      </w:r>
-                      <w:r>
-                        <w:rPr>
-                          <w:rFonts w:ascii="Arial" w:hAnsi="Arial"/>
-                          <w:color w:val="000000"/>
-                          <w:sz w:val="15"/>
-                          <w:szCs w:val="15"/>
-                        </w:rPr>
-                        <w:t>(n = 47)</w:t>
-                      </w:r>
-                    </w:p>
-                  </w:txbxContent>
-                </v:textbox>
-              </v:rect>
-            </w:pict>
-          </mc:Fallback>
-        </mc:AlternateContent>
-      </w:r>
-      <w:r>
-        <w:rPr>
-          <w:noProof/>
-          <w:lang w:val="en-MY" w:eastAsia="en-MY"/>
-        </w:rPr>
-        <mc:AlternateContent>
-          <mc:Choice Requires="wps">
-            <w:drawing>
               <wp:anchor distT="0" distB="0" distL="114300" distR="114300" simplePos="0" relativeHeight="251681792" behindDoc="0" locked="0" layoutInCell="1" allowOverlap="1" wp14:anchorId="268C9137" wp14:editId="79ABBB27">
                 <wp:simplePos x="0" y="0"/>
                 <wp:positionH relativeFrom="column">
@@ -1454,7 +1294,7 @@
           </mc:Choice>
           <mc:Fallback>
             <w:pict>
-              <v:rect w14:anchorId="4C37AEA5" id="Rectangle 3" o:spid="_x0000_s1033" style="position:absolute;margin-left:44.05pt;margin-top:5.9pt;width:148.6pt;height:41.45pt;z-index:251663360;visibility:visible;mso-wrap-style:square;mso-width-percent:0;mso-height-percent:0;mso-wrap-distance-left:9pt;mso-wrap-distance-top:0;mso-wrap-distance-right:9pt;mso-wrap-distance-bottom:0;mso-position-horizontal:absolute;mso-position-horizontal-relative:text;mso-position-vertical:absolute;mso-position-vertical-relative:text;mso-width-percent:0;mso-height-percent:0;mso-width-relative:margin;mso-height-relative:margin;v-text-anchor:middle" o:gfxdata="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" filled="f" strokecolor="black [3213]" strokeweight="1pt">
+              <v:rect w14:anchorId="4C37AEA5" id="Rectangle 3" o:spid="_x0000_s1032" style="position:absolute;margin-left:44.05pt;margin-top:5.9pt;width:148.6pt;height:41.45pt;z-index:251663360;visibility:visible;mso-wrap-style:square;mso-width-percent:0;mso-height-percent:0;mso-wrap-distance-left:9pt;mso-wrap-distance-top:0;mso-wrap-distance-right:9pt;mso-wrap-distance-bottom:0;mso-position-horizontal:absolute;mso-position-horizontal-relative:text;mso-position-vertical:absolute;mso-position-vertical-relative:text;mso-width-percent:0;mso-height-percent:0;mso-width-relative:margin;mso-height-relative:margin;v-text-anchor:middle" o:gfxdata="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" filled="f" strokecolor="black [3213]" strokeweight="1pt">
                 <v:textbox>
                   <w:txbxContent>
                     <w:p>
@@ -1481,6 +1321,148 @@
                           <w:szCs w:val="15"/>
                         </w:rPr>
                         <w:t>(n = 96)</w:t>
+                      </w:r>
+                    </w:p>
+                  </w:txbxContent>
+                </v:textbox>
+              </v:rect>
+            </w:pict>
+          </mc:Fallback>
+        </mc:AlternateContent>
+      </w:r>
+      <w:r>
+        <w:rPr>
+          <w:noProof/>
+          <w:lang w:val="en-MY" w:eastAsia="en-MY"/>
+        </w:rPr>
+        <mc:AlternateContent>
+          <mc:Choice Requires="wps">
+            <w:drawing>
+              <wp:anchor distT="0" distB="0" distL="114300" distR="114300" simplePos="0" relativeHeight="251665408" behindDoc="0" locked="0" layoutInCell="1" allowOverlap="1" wp14:anchorId="4FF0996A" wp14:editId="5C3A5F6F">
+                <wp:simplePos x="0" y="0"/>
+                <wp:positionH relativeFrom="column">
+                  <wp:posOffset>3048000</wp:posOffset>
+                </wp:positionH>
+                <wp:positionV relativeFrom="paragraph">
+                  <wp:posOffset>74930</wp:posOffset>
+                </wp:positionV>
+                <wp:extent cx="1887220" cy="526415"/>
+                <wp:effectExtent l="0" t="0" r="17780" b="26035"/>
+                <wp:wrapNone/>
+                <wp:docPr id="4" name="Rectangle 4"/>
+                <wp:cNvGraphicFramePr/>
+                <a:graphic xmlns:a="http://schemas.openxmlformats.org/drawingml/2006/main">
+                  <a:graphicData uri="http://schemas.microsoft.com/office/word/2010/wordprocessingShape">
+                    <wps:wsp>
+                      <wps:cNvSpPr/>
+                      <wps:spPr>
+                        <a:xfrm>
+                          <a:off x="0" y="0"/>
+                          <a:ext cx="1887220" cy="526415"/>
+                        </a:xfrm>
+                        <a:prstGeom prst="rect">
+                          <a:avLst/>
+                        </a:prstGeom>
+                        <a:noFill/>
+                        <a:ln>
+                          <a:solidFill>
+                            <a:schemeClr val="tx1"/>
+                          </a:solidFill>
+                        </a:ln>
+                      </wps:spPr>
+                      <wps:style>
+                        <a:lnRef idx="2">
+                          <a:schemeClr val="accent1">
+                            <a:shade val="50000"/>
+                          </a:schemeClr>
+                        </a:lnRef>
+                        <a:fillRef idx="1">
+                          <a:schemeClr val="accent1"/>
+                        </a:fillRef>
+                        <a:effectRef idx="0">
+                          <a:schemeClr val="accent1"/>
+                        </a:effectRef>
+                        <a:fontRef idx="minor">
+                          <a:schemeClr val="lt1"/>
+                        </a:fontRef>
+                      </wps:style>
+                      <wps:txbx>
+                        <w:txbxContent>
+                          <w:p>
+                            <w:pPr>
+                              <w:jc w:val="center"/>
+                            </w:pPr>
+                            <w:r>
+                              <w:rPr>
+                                <w:rFonts w:ascii="Arial" w:hAnsi="Arial"/>
+                                <w:color w:val="000000"/>
+                                <w:sz w:val="15"/>
+                                <w:szCs w:val="15"/>
+                              </w:rPr>
+                              <w:t>Records excluded</w:t>
+                            </w:r>
+                            <w:r>
+                              <w:br/>
+                            </w:r>
+                            <w:r>
+                              <w:rPr>
+                                <w:rFonts w:ascii="Arial" w:hAnsi="Arial"/>
+                                <w:color w:val="000000"/>
+                                <w:sz w:val="15"/>
+                                <w:szCs w:val="15"/>
+                              </w:rPr>
+                              <w:t>(n = 47)</w:t>
+                            </w:r>
+                          </w:p>
+                        </w:txbxContent>
+                      </wps:txbx>
+                      <wps:bodyPr rot="0" spcFirstLastPara="0" vertOverflow="overflow" horzOverflow="overflow" vert="horz" wrap="square" lIns="91440" tIns="45720" rIns="91440" bIns="45720" numCol="1" spcCol="0" rtlCol="0" fromWordArt="0" anchor="ctr" anchorCtr="0" forceAA="0" compatLnSpc="1">
+                        <a:prstTxWarp prst="textNoShape">
+                          <a:avLst/>
+                        </a:prstTxWarp>
+                        <a:noAutofit/>
+                      </wps:bodyPr>
+                    </wps:wsp>
+                  </a:graphicData>
+                </a:graphic>
+                <wp14:sizeRelH relativeFrom="margin">
+                  <wp14:pctWidth>0</wp14:pctWidth>
+                </wp14:sizeRelH>
+                <wp14:sizeRelV relativeFrom="margin">
+                  <wp14:pctHeight>0</wp14:pctHeight>
+                </wp14:sizeRelV>
+              </wp:anchor>
+            </w:drawing>
+          </mc:Choice>
+          <mc:Fallback>
+            <w:pict>
+              <v:rect w14:anchorId="4FF0996A" id="Rectangle 4" o:spid="_x0000_s1033" style="position:absolute;margin-left:240pt;margin-top:5.9pt;width:148.6pt;height:41.45pt;z-index:251665408;visibility:visible;mso-wrap-style:square;mso-width-percent:0;mso-height-percent:0;mso-wrap-distance-left:9pt;mso-wrap-distance-top:0;mso-wrap-distance-right:9pt;mso-wrap-distance-bottom:0;mso-position-horizontal:absolute;mso-position-horizontal-relative:text;mso-position-vertical:absolute;mso-position-vertical-relative:text;mso-width-percent:0;mso-height-percent:0;mso-width-relative:margin;mso-height-relative:margin;v-text-anchor:middle" o:gfxdata="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" filled="f" strokecolor="black [3213]" strokeweight="1pt">
+                <v:textbox>
+                  <w:txbxContent>
+                    <w:p>
+                      <w:pPr>
+                        <w:jc w:val="center"/>
+                      </w:pPr>
+                      <w:r>
+                        <w:rPr>
+                          <w:rFonts w:ascii="Arial" w:hAnsi="Arial"/>
+                          <w:color w:val="000000"/>
+                          <w:sz w:val="15"/>
+                          <w:szCs w:val="15"/>
+                        </w:rPr>
+                        <w:t>Records excluded</w:t>
+                      </w:r>
+                      <w:r>
+                        <w:br/>
+                      </w:r>
+                      <w:r>
+                        <w:rPr>
+                          <w:rFonts w:ascii="Arial" w:hAnsi="Arial"/>
+                          <w:color w:val="000000"/>
+                          <w:sz w:val="15"/>
+                          <w:szCs w:val="15"/>
+                        </w:rPr>
+                        <w:t>(n = 47)</w:t>
                       </w:r>
                     </w:p>
                   </w:txbxContent>
@@ -1581,8 +1563,6 @@
         <w:spacing w:after="0" w:line="240" w:lineRule="auto"/>
       </w:pPr>
     </w:p>
-    <w:bookmarkStart w:id="0" w:name="_GoBack"/>
-    <w:bookmarkEnd w:id="0"/>
     <w:p>
       <w:pPr>
         <w:spacing w:after="0" w:line="240" w:lineRule="auto"/>
@@ -1656,7 +1636,16 @@
                                 <w:sz w:val="15"/>
                                 <w:szCs w:val="15"/>
                               </w:rPr>
-                              <w:t>Eligible backup records not cited in current draft</w:t>
+                              <w:t xml:space="preserve">Eligible backup records not cited in </w:t>
+                            </w:r>
+                            <w:r>
+                              <w:rPr>
+                                <w:rFonts w:ascii="Arial" w:hAnsi="Arial"/>
+                                <w:color w:val="000000"/>
+                                <w:sz w:val="15"/>
+                                <w:szCs w:val="15"/>
+                              </w:rPr>
+                              <w:t>current report</w:t>
                             </w:r>
                             <w:r>
                               <w:br/>
@@ -1707,7 +1696,7 @@
                           <w:sz w:val="15"/>
                           <w:szCs w:val="15"/>
                         </w:rPr>
-                        <w:t>Eligible backup records not cited in current draft</w:t>
+                        <w:t>Eligible backup records not cited in current report</w:t>
                       </w:r>
                       <w:r>
                         <w:br/>
@@ -2152,7 +2141,7 @@
                                 <w:sz w:val="15"/>
                                 <w:szCs w:val="15"/>
                               </w:rPr>
-                              <w:t>Eligible backup records not cited in current draft</w:t>
+                              <w:t>Eligible backup records not cited in current report</w:t>
                             </w:r>
                             <w:r>
                               <w:br/>
@@ -2203,7 +2192,7 @@
                           <w:sz w:val="15"/>
                           <w:szCs w:val="15"/>
                         </w:rPr>
-                        <w:t>Eligible backup records not cited in current draft</w:t>
+                        <w:t>Eligible backup records not cited in current report</w:t>
                       </w:r>
                       <w:r>
                         <w:br/>
@@ -3186,16 +3175,7 @@
                                 <w:sz w:val="15"/>
                                 <w:szCs w:val="15"/>
                               </w:rPr>
-                              <w:t xml:space="preserve">Core </w:t>
-                            </w:r>
-                            <w:r>
-                              <w:rPr>
-                                <w:rFonts w:ascii="Arial" w:hAnsi="Arial"/>
-                                <w:color w:val="000000"/>
-                                <w:sz w:val="15"/>
-                                <w:szCs w:val="15"/>
-                              </w:rPr>
-                              <w:t>separation (n = 18)</w:t>
+                              <w:t>Core separation (n = 18)</w:t>
                             </w:r>
                             <w:r>
                               <w:br/>
@@ -3529,6 +3509,8 @@
       <w:pPr>
         <w:spacing w:after="0" w:line="240" w:lineRule="auto"/>
       </w:pPr>
+      <w:bookmarkStart w:id="0" w:name="_GoBack"/>
+      <w:bookmarkEnd w:id="0"/>
     </w:p>
     <w:p>
       <w:pPr>
@@ -3845,7 +3827,19 @@
         </w:rPr>
       </w:pPr>
     </w:p>
+    <w:p>
+      <w:pPr>
+        <w:pStyle w:val="CM1"/>
+        <w:spacing w:before="120"/>
+        <w:rPr>
+          <w:rFonts w:ascii="Arial" w:hAnsi="Arial" w:cs="Arial"/>
+          <w:sz w:val="18"/>
+          <w:szCs w:val="18"/>
+        </w:rPr>
+      </w:pPr>
+    </w:p>
     <w:sectPr>
+      <w:headerReference w:type="default" r:id="rId8"/>
       <w:pgSz w:w="16838" w:h="11906" w:orient="landscape"/>
       <w:pgMar w:top="720" w:right="720" w:bottom="720" w:left="720" w:header="708" w:footer="708" w:gutter="0"/>
       <w:cols w:space="708"/>
@@ -3903,6 +3897,19 @@
     </w:p>
   </w:footnote>
 </w:footnotes>
+</file>
+
+<file path=word/header1.xml><?xml version="1.0" encoding="utf-8"?>
+<w:hdr xmlns:wpc="http://schemas.microsoft.com/office/word/2010/wordprocessingCanvas" xmlns:mc="http://schemas.openxmlformats.org/markup-compatibility/2006" xmlns:o="urn:schemas-microsoft-com:office:office" xmlns:r="http://schemas.openxmlformats.org/officeDocument/2006/relationships" xmlns:m="http://schemas.openxmlformats.org/officeDocument/2006/math" xmlns:v="urn:schemas-microsoft-com:vml" xmlns:wp14="http://schemas.microsoft.com/office/word/2010/wordprocessingDrawing" xmlns:wp="http://schemas.openxmlformats.org/drawingml/2006/wordprocessingDrawing" xmlns:w10="urn:schemas-microsoft-com:office:word" xmlns:w="http://schemas.openxmlformats.org/wordprocessingml/2006/main" xmlns:w14="http://schemas.microsoft.com/office/word/2010/wordml" xmlns:w15="http://schemas.microsoft.com/office/word/2012/wordml" xmlns:wpg="http://schemas.microsoft.com/office/word/2010/wordprocessingGroup" xmlns:wpi="http://schemas.microsoft.com/office/word/2010/wordprocessingInk" xmlns:wne="http://schemas.microsoft.com/office/word/2006/wordml" xmlns:wps="http://schemas.microsoft.com/office/word/2010/wordprocessingShape" mc:Ignorable="w14 w15 wp14">
+  <w:p>
+    <w:pPr>
+      <w:spacing w:after="0" w:line="240" w:lineRule="auto"/>
+      <w:rPr>
+        <w:b/>
+      </w:rPr>
+    </w:pPr>
+  </w:p>
+</w:hdr>
 </file>
 
 <file path=word/numbering.xml><?xml version="1.0" encoding="utf-8"?>
@@ -4890,7 +4897,7 @@
 </file>
 
 <file path=customXml/itemProps1.xml><?xml version="1.0" encoding="utf-8"?>
-<ds:datastoreItem xmlns:ds="http://schemas.openxmlformats.org/officeDocument/2006/customXml" ds:itemID="{DC33BF51-F1E3-441E-B357-F0E2F8B26267}">
+<ds:datastoreItem xmlns:ds="http://schemas.openxmlformats.org/officeDocument/2006/customXml" ds:itemID="{9154E1F0-84A9-45FE-95BA-1E3DB8288851}">
   <ds:schemaRefs>
     <ds:schemaRef ds:uri="http://schemas.openxmlformats.org/officeDocument/2006/bibliography"/>
   </ds:schemaRefs>

</xml_diff>